<commit_message>
chore: 2026-08-06 19:59 auto commit
</commit_message>
<xml_diff>
--- a/docs/硬件说明.docx
+++ b/docs/硬件说明.docx
@@ -6,6 +6,7 @@
     <w:p>
       <w:pPr>
         <w:pStyle w:val="Heading1"/>
+        <w:spacing w:line="360" w:lineRule="auto"/>
         <w:jc w:val="center"/>
       </w:pPr>
       <w:r>
@@ -20,27 +21,32 @@
     <w:p>
       <w:pPr>
         <w:pStyle w:val="FirstParagraph"/>
-      </w:pPr>
-      <w:r>
-        <w:rPr>
-          <w:rFonts w:hint="eastAsia"/>
+        <w:spacing w:line="360" w:lineRule="auto"/>
+      </w:pPr>
+      <w:r>
+        <w:rPr>
+          <w:rFonts w:hint="eastAsia" w:ascii="Times New Roman" w:hAnsi="Times New Roman" w:eastAsia="宋体"/>
           <w:b/>
           <w:bCs/>
+          <w:sz w:val="24"/>
         </w:rPr>
         <w:t xml:space="preserve">基于</w:t>
       </w:r>
       <w:r>
         <w:rPr>
+          <w:rFonts w:ascii="Times New Roman" w:hAnsi="Times New Roman" w:eastAsia="宋体"/>
           <w:b/>
           <w:bCs/>
+          <w:sz w:val="24"/>
         </w:rPr>
         <w:t xml:space="preserve"> Arduino UNO R4 WiFi </w:t>
       </w:r>
       <w:r>
         <w:rPr>
-          <w:rFonts w:hint="eastAsia"/>
+          <w:rFonts w:hint="eastAsia" w:ascii="Times New Roman" w:hAnsi="Times New Roman" w:eastAsia="宋体"/>
           <w:b/>
           <w:bCs/>
+          <w:sz w:val="24"/>
         </w:rPr>
         <w:t xml:space="preserve">的弯举训练肌电采集硬件系统</w:t>
       </w:r>
@@ -48,19 +54,26 @@
     <w:p>
       <w:pPr>
         <w:pStyle w:val="BlockText"/>
-      </w:pPr>
-      <w:r>
-        <w:rPr>
-          <w:rFonts w:hint="eastAsia"/>
+        <w:spacing w:line="360" w:lineRule="auto"/>
+      </w:pPr>
+      <w:r>
+        <w:rPr>
+          <w:rFonts w:hint="eastAsia" w:ascii="Times New Roman" w:hAnsi="Times New Roman" w:eastAsia="宋体"/>
+          <w:sz w:val="24"/>
         </w:rPr>
         <w:t xml:space="preserve">版本：V1.0</w:t>
       </w:r>
       <w:r>
+        <w:rPr>
+          <w:rFonts w:ascii="Times New Roman" w:hAnsi="Times New Roman" w:eastAsia="宋体"/>
+          <w:sz w:val="24"/>
+        </w:rPr>
         <w:t xml:space="preserve"> | </w:t>
       </w:r>
       <w:r>
         <w:rPr>
-          <w:rFonts w:hint="eastAsia"/>
+          <w:rFonts w:hint="eastAsia" w:ascii="Times New Roman" w:hAnsi="Times New Roman" w:eastAsia="宋体"/>
+          <w:sz w:val="24"/>
         </w:rPr>
         <w:t xml:space="preserve">更新：2026-07-11</w:t>
       </w:r>
@@ -68,10 +81,12 @@
     <w:p>
       <w:pPr>
         <w:pStyle w:val="BlockText"/>
-      </w:pPr>
-      <w:r>
-        <w:rPr>
-          <w:rFonts w:hint="eastAsia"/>
+        <w:spacing w:line="360" w:lineRule="auto"/>
+      </w:pPr>
+      <w:r>
+        <w:rPr>
+          <w:rFonts w:hint="eastAsia" w:ascii="Times New Roman" w:hAnsi="Times New Roman" w:eastAsia="宋体"/>
+          <w:sz w:val="24"/>
         </w:rPr>
         <w:t xml:space="preserve">课题名称：基于表面肌电的个性化弯举疲劳预警臂带</w:t>
       </w:r>
@@ -102,10 +117,12 @@
           <w:ilvl w:val="0"/>
           <w:numId w:val="1001"/>
         </w:numPr>
-      </w:pPr>
-      <w:r>
-        <w:rPr>
-          <w:rFonts w:hint="eastAsia"/>
+        <w:spacing w:line="360" w:lineRule="auto"/>
+      </w:pPr>
+      <w:r>
+        <w:rPr>
+          <w:rFonts w:hint="eastAsia" w:ascii="Times New Roman" w:hAnsi="Times New Roman" w:eastAsia="宋体"/>
+          <w:sz w:val="24"/>
         </w:rPr>
         <w:t xml:space="preserve">系统概览</w:t>
       </w:r>
@@ -117,10 +134,12 @@
           <w:ilvl w:val="0"/>
           <w:numId w:val="1001"/>
         </w:numPr>
-      </w:pPr>
-      <w:r>
-        <w:rPr>
-          <w:rFonts w:hint="eastAsia"/>
+        <w:spacing w:line="360" w:lineRule="auto"/>
+      </w:pPr>
+      <w:r>
+        <w:rPr>
+          <w:rFonts w:hint="eastAsia" w:ascii="Times New Roman" w:hAnsi="Times New Roman" w:eastAsia="宋体"/>
+          <w:sz w:val="24"/>
         </w:rPr>
         <w:t xml:space="preserve">核心器件</w:t>
       </w:r>
@@ -132,17 +151,27 @@
           <w:ilvl w:val="1"/>
           <w:numId w:val="1002"/>
         </w:numPr>
-      </w:pPr>
-      <w:r>
+        <w:spacing w:line="360" w:lineRule="auto"/>
+      </w:pPr>
+      <w:r>
+        <w:rPr>
+          <w:rFonts w:ascii="Times New Roman" w:hAnsi="Times New Roman" w:eastAsia="宋体"/>
+          <w:sz w:val="24"/>
+        </w:rPr>
         <w:t xml:space="preserve">2.1 </w:t>
       </w:r>
       <w:r>
         <w:rPr>
-          <w:rFonts w:hint="eastAsia"/>
+          <w:rFonts w:hint="eastAsia" w:ascii="Times New Roman" w:hAnsi="Times New Roman" w:eastAsia="宋体"/>
+          <w:sz w:val="24"/>
         </w:rPr>
         <w:t xml:space="preserve">主控：Arduino</w:t>
       </w:r>
       <w:r>
+        <w:rPr>
+          <w:rFonts w:ascii="Times New Roman" w:hAnsi="Times New Roman" w:eastAsia="宋体"/>
+          <w:sz w:val="24"/>
+        </w:rPr>
         <w:t xml:space="preserve"> UNO R4 WiFi</w:t>
       </w:r>
     </w:p>
@@ -153,13 +182,19 @@
           <w:ilvl w:val="1"/>
           <w:numId w:val="1002"/>
         </w:numPr>
-      </w:pPr>
-      <w:r>
+        <w:spacing w:line="360" w:lineRule="auto"/>
+      </w:pPr>
+      <w:r>
+        <w:rPr>
+          <w:rFonts w:ascii="Times New Roman" w:hAnsi="Times New Roman" w:eastAsia="宋体"/>
+          <w:sz w:val="24"/>
+        </w:rPr>
         <w:t xml:space="preserve">2.2 </w:t>
       </w:r>
       <w:r>
         <w:rPr>
-          <w:rFonts w:hint="eastAsia"/>
+          <w:rFonts w:hint="eastAsia" w:ascii="Times New Roman" w:hAnsi="Times New Roman" w:eastAsia="宋体"/>
+          <w:sz w:val="24"/>
         </w:rPr>
         <w:t xml:space="preserve">肌电传感器模块</w:t>
       </w:r>
@@ -171,13 +206,19 @@
           <w:ilvl w:val="1"/>
           <w:numId w:val="1002"/>
         </w:numPr>
-      </w:pPr>
-      <w:r>
+        <w:spacing w:line="360" w:lineRule="auto"/>
+      </w:pPr>
+      <w:r>
+        <w:rPr>
+          <w:rFonts w:ascii="Times New Roman" w:hAnsi="Times New Roman" w:eastAsia="宋体"/>
+          <w:sz w:val="24"/>
+        </w:rPr>
         <w:t xml:space="preserve">2.3 </w:t>
       </w:r>
       <w:r>
         <w:rPr>
-          <w:rFonts w:hint="eastAsia"/>
+          <w:rFonts w:hint="eastAsia" w:ascii="Times New Roman" w:hAnsi="Times New Roman" w:eastAsia="宋体"/>
+          <w:sz w:val="24"/>
         </w:rPr>
         <w:t xml:space="preserve">电极</w:t>
       </w:r>
@@ -189,10 +230,12 @@
           <w:ilvl w:val="0"/>
           <w:numId w:val="1001"/>
         </w:numPr>
-      </w:pPr>
-      <w:r>
-        <w:rPr>
-          <w:rFonts w:hint="eastAsia"/>
+        <w:spacing w:line="360" w:lineRule="auto"/>
+      </w:pPr>
+      <w:r>
+        <w:rPr>
+          <w:rFonts w:hint="eastAsia" w:ascii="Times New Roman" w:hAnsi="Times New Roman" w:eastAsia="宋体"/>
+          <w:sz w:val="24"/>
         </w:rPr>
         <w:t xml:space="preserve">电路连接</w:t>
       </w:r>
@@ -204,13 +247,19 @@
           <w:ilvl w:val="1"/>
           <w:numId w:val="1003"/>
         </w:numPr>
-      </w:pPr>
-      <w:r>
+        <w:spacing w:line="360" w:lineRule="auto"/>
+      </w:pPr>
+      <w:r>
+        <w:rPr>
+          <w:rFonts w:ascii="Times New Roman" w:hAnsi="Times New Roman" w:eastAsia="宋体"/>
+          <w:sz w:val="24"/>
+        </w:rPr>
         <w:t xml:space="preserve">3.1 </w:t>
       </w:r>
       <w:r>
         <w:rPr>
-          <w:rFonts w:hint="eastAsia"/>
+          <w:rFonts w:hint="eastAsia" w:ascii="Times New Roman" w:hAnsi="Times New Roman" w:eastAsia="宋体"/>
+          <w:sz w:val="24"/>
         </w:rPr>
         <w:t xml:space="preserve">信号链路</w:t>
       </w:r>
@@ -222,17 +271,27 @@
           <w:ilvl w:val="1"/>
           <w:numId w:val="1003"/>
         </w:numPr>
-      </w:pPr>
-      <w:r>
+        <w:spacing w:line="360" w:lineRule="auto"/>
+      </w:pPr>
+      <w:r>
+        <w:rPr>
+          <w:rFonts w:ascii="Times New Roman" w:hAnsi="Times New Roman" w:eastAsia="宋体"/>
+          <w:sz w:val="24"/>
+        </w:rPr>
         <w:t xml:space="preserve">3.2 </w:t>
       </w:r>
       <w:r>
         <w:rPr>
-          <w:rFonts w:hint="eastAsia"/>
+          <w:rFonts w:hint="eastAsia" w:ascii="Times New Roman" w:hAnsi="Times New Roman" w:eastAsia="宋体"/>
+          <w:sz w:val="24"/>
         </w:rPr>
         <w:t xml:space="preserve">传感器</w:t>
       </w:r>
       <w:r>
+        <w:rPr>
+          <w:rFonts w:ascii="Times New Roman" w:hAnsi="Times New Roman" w:eastAsia="宋体"/>
+          <w:sz w:val="24"/>
+        </w:rPr>
         <w:t xml:space="preserve"> → Arduino</w:t>
       </w:r>
     </w:p>
@@ -243,13 +302,19 @@
           <w:ilvl w:val="1"/>
           <w:numId w:val="1003"/>
         </w:numPr>
-      </w:pPr>
-      <w:r>
+        <w:spacing w:line="360" w:lineRule="auto"/>
+      </w:pPr>
+      <w:r>
+        <w:rPr>
+          <w:rFonts w:ascii="Times New Roman" w:hAnsi="Times New Roman" w:eastAsia="宋体"/>
+          <w:sz w:val="24"/>
+        </w:rPr>
         <w:t xml:space="preserve">3.3 </w:t>
       </w:r>
       <w:r>
         <w:rPr>
-          <w:rFonts w:hint="eastAsia"/>
+          <w:rFonts w:hint="eastAsia" w:ascii="Times New Roman" w:hAnsi="Times New Roman" w:eastAsia="宋体"/>
+          <w:sz w:val="24"/>
         </w:rPr>
         <w:t xml:space="preserve">板载外设</w:t>
       </w:r>
@@ -261,13 +326,19 @@
           <w:ilvl w:val="1"/>
           <w:numId w:val="1003"/>
         </w:numPr>
-      </w:pPr>
-      <w:r>
+        <w:spacing w:line="360" w:lineRule="auto"/>
+      </w:pPr>
+      <w:r>
+        <w:rPr>
+          <w:rFonts w:ascii="Times New Roman" w:hAnsi="Times New Roman" w:eastAsia="宋体"/>
+          <w:sz w:val="24"/>
+        </w:rPr>
         <w:t xml:space="preserve">3.4 RGB </w:t>
       </w:r>
       <w:r>
         <w:rPr>
-          <w:rFonts w:hint="eastAsia"/>
+          <w:rFonts w:hint="eastAsia" w:ascii="Times New Roman" w:hAnsi="Times New Roman" w:eastAsia="宋体"/>
+          <w:sz w:val="24"/>
         </w:rPr>
         <w:t xml:space="preserve">状态指示（疲劳灯）</w:t>
       </w:r>
@@ -279,13 +350,19 @@
           <w:ilvl w:val="1"/>
           <w:numId w:val="1003"/>
         </w:numPr>
-      </w:pPr>
-      <w:r>
+        <w:spacing w:line="360" w:lineRule="auto"/>
+      </w:pPr>
+      <w:r>
+        <w:rPr>
+          <w:rFonts w:ascii="Times New Roman" w:hAnsi="Times New Roman" w:eastAsia="宋体"/>
+          <w:sz w:val="24"/>
+        </w:rPr>
         <w:t xml:space="preserve">3.5 </w:t>
       </w:r>
       <w:r>
         <w:rPr>
-          <w:rFonts w:hint="eastAsia"/>
+          <w:rFonts w:hint="eastAsia" w:ascii="Times New Roman" w:hAnsi="Times New Roman" w:eastAsia="宋体"/>
+          <w:sz w:val="24"/>
         </w:rPr>
         <w:t xml:space="preserve">引脚分配总表</w:t>
       </w:r>
@@ -297,10 +374,12 @@
           <w:ilvl w:val="0"/>
           <w:numId w:val="1001"/>
         </w:numPr>
-      </w:pPr>
-      <w:r>
-        <w:rPr>
-          <w:rFonts w:hint="eastAsia"/>
+        <w:spacing w:line="360" w:lineRule="auto"/>
+      </w:pPr>
+      <w:r>
+        <w:rPr>
+          <w:rFonts w:hint="eastAsia" w:ascii="Times New Roman" w:hAnsi="Times New Roman" w:eastAsia="宋体"/>
+          <w:sz w:val="24"/>
         </w:rPr>
         <w:t xml:space="preserve">硬件佩戴与使用</w:t>
       </w:r>
@@ -312,13 +391,19 @@
           <w:ilvl w:val="1"/>
           <w:numId w:val="1004"/>
         </w:numPr>
-      </w:pPr>
-      <w:r>
+        <w:spacing w:line="360" w:lineRule="auto"/>
+      </w:pPr>
+      <w:r>
+        <w:rPr>
+          <w:rFonts w:ascii="Times New Roman" w:hAnsi="Times New Roman" w:eastAsia="宋体"/>
+          <w:sz w:val="24"/>
+        </w:rPr>
         <w:t xml:space="preserve">4.1 </w:t>
       </w:r>
       <w:r>
         <w:rPr>
-          <w:rFonts w:hint="eastAsia"/>
+          <w:rFonts w:hint="eastAsia" w:ascii="Times New Roman" w:hAnsi="Times New Roman" w:eastAsia="宋体"/>
+          <w:sz w:val="24"/>
         </w:rPr>
         <w:t xml:space="preserve">传感器佩戴位置</w:t>
       </w:r>
@@ -330,13 +415,19 @@
           <w:ilvl w:val="1"/>
           <w:numId w:val="1004"/>
         </w:numPr>
-      </w:pPr>
-      <w:r>
+        <w:spacing w:line="360" w:lineRule="auto"/>
+      </w:pPr>
+      <w:r>
+        <w:rPr>
+          <w:rFonts w:ascii="Times New Roman" w:hAnsi="Times New Roman" w:eastAsia="宋体"/>
+          <w:sz w:val="24"/>
+        </w:rPr>
         <w:t xml:space="preserve">4.2 </w:t>
       </w:r>
       <w:r>
         <w:rPr>
-          <w:rFonts w:hint="eastAsia"/>
+          <w:rFonts w:hint="eastAsia" w:ascii="Times New Roman" w:hAnsi="Times New Roman" w:eastAsia="宋体"/>
+          <w:sz w:val="24"/>
         </w:rPr>
         <w:t xml:space="preserve">信号质量判断</w:t>
       </w:r>
@@ -348,13 +439,19 @@
           <w:ilvl w:val="1"/>
           <w:numId w:val="1004"/>
         </w:numPr>
-      </w:pPr>
-      <w:r>
+        <w:spacing w:line="360" w:lineRule="auto"/>
+      </w:pPr>
+      <w:r>
+        <w:rPr>
+          <w:rFonts w:ascii="Times New Roman" w:hAnsi="Times New Roman" w:eastAsia="宋体"/>
+          <w:sz w:val="24"/>
+        </w:rPr>
         <w:t xml:space="preserve">4.3 </w:t>
       </w:r>
       <w:r>
         <w:rPr>
-          <w:rFonts w:hint="eastAsia"/>
+          <w:rFonts w:hint="eastAsia" w:ascii="Times New Roman" w:hAnsi="Times New Roman" w:eastAsia="宋体"/>
+          <w:sz w:val="24"/>
         </w:rPr>
         <w:t xml:space="preserve">电源要求</w:t>
       </w:r>
@@ -366,10 +463,12 @@
           <w:ilvl w:val="0"/>
           <w:numId w:val="1001"/>
         </w:numPr>
-      </w:pPr>
-      <w:r>
-        <w:rPr>
-          <w:rFonts w:hint="eastAsia"/>
+        <w:spacing w:line="360" w:lineRule="auto"/>
+      </w:pPr>
+      <w:r>
+        <w:rPr>
+          <w:rFonts w:hint="eastAsia" w:ascii="Times New Roman" w:hAnsi="Times New Roman" w:eastAsia="宋体"/>
+          <w:sz w:val="24"/>
         </w:rPr>
         <w:t xml:space="preserve">注意事项</w:t>
       </w:r>
@@ -400,10 +499,12 @@
     <w:p>
       <w:pPr>
         <w:pStyle w:val="BlockText"/>
-      </w:pPr>
-      <w:r>
-        <w:rPr>
-          <w:rFonts w:hint="eastAsia"/>
+        <w:spacing w:line="360" w:lineRule="auto"/>
+      </w:pPr>
+      <w:r>
+        <w:rPr>
+          <w:rFonts w:hint="eastAsia" w:ascii="Times New Roman" w:hAnsi="Times New Roman" w:eastAsia="宋体"/>
+          <w:sz w:val="24"/>
         </w:rPr>
         <w:t xml:space="preserve">硬件是算法的物理载体。应同时参阅：</w:t>
       </w:r>
@@ -415,6 +516,7 @@
           <w:ilvl w:val="0"/>
           <w:numId w:val="1005"/>
         </w:numPr>
+        <w:spacing w:line="360" w:lineRule="auto"/>
       </w:pPr>
       <w:hyperlink r:id="rId10">
         <w:r>
@@ -426,32 +528,51 @@
         </w:r>
       </w:hyperlink>
       <w:r>
+        <w:rPr>
+          <w:rFonts w:ascii="Times New Roman" w:hAnsi="Times New Roman" w:eastAsia="宋体"/>
+          <w:sz w:val="24"/>
+        </w:rPr>
         <w:t xml:space="preserve"> </w:t>
       </w:r>
       <w:r>
+        <w:rPr>
+          <w:rFonts w:ascii="Times New Roman" w:hAnsi="Times New Roman" w:eastAsia="宋体"/>
+          <w:sz w:val="24"/>
+        </w:rPr>
         <w:t xml:space="preserve">— </w:t>
       </w:r>
       <w:r>
         <w:rPr>
-          <w:rFonts w:hint="eastAsia"/>
+          <w:rFonts w:hint="eastAsia" w:ascii="Times New Roman" w:hAnsi="Times New Roman" w:eastAsia="宋体"/>
+          <w:sz w:val="24"/>
         </w:rPr>
         <w:t xml:space="preserve">信号处理、RMS</w:t>
       </w:r>
       <w:r>
+        <w:rPr>
+          <w:rFonts w:ascii="Times New Roman" w:hAnsi="Times New Roman" w:eastAsia="宋体"/>
+          <w:sz w:val="24"/>
+        </w:rPr>
         <w:t xml:space="preserve"> / MDF / </w:t>
       </w:r>
       <w:r>
         <w:rPr>
-          <w:rFonts w:hint="eastAsia"/>
+          <w:rFonts w:hint="eastAsia" w:ascii="Times New Roman" w:hAnsi="Times New Roman" w:eastAsia="宋体"/>
+          <w:sz w:val="24"/>
         </w:rPr>
         <w:t xml:space="preserve">激活度</w:t>
       </w:r>
       <w:r>
+        <w:rPr>
+          <w:rFonts w:ascii="Times New Roman" w:hAnsi="Times New Roman" w:eastAsia="宋体"/>
+          <w:sz w:val="24"/>
+        </w:rPr>
         <w:t xml:space="preserve"> / </w:t>
       </w:r>
       <w:r>
         <w:rPr>
-          <w:rFonts w:hint="eastAsia"/>
+          <w:rFonts w:hint="eastAsia" w:ascii="Times New Roman" w:hAnsi="Times New Roman" w:eastAsia="宋体"/>
+          <w:sz w:val="24"/>
         </w:rPr>
         <w:t xml:space="preserve">疲劳度算法</w:t>
       </w:r>
@@ -463,6 +584,7 @@
           <w:ilvl w:val="0"/>
           <w:numId w:val="1006"/>
         </w:numPr>
+        <w:spacing w:line="360" w:lineRule="auto"/>
       </w:pPr>
       <w:hyperlink r:id="rId11">
         <w:r>
@@ -474,14 +596,23 @@
         </w:r>
       </w:hyperlink>
       <w:r>
+        <w:rPr>
+          <w:rFonts w:ascii="Times New Roman" w:hAnsi="Times New Roman" w:eastAsia="宋体"/>
+          <w:sz w:val="24"/>
+        </w:rPr>
         <w:t xml:space="preserve"> </w:t>
       </w:r>
       <w:r>
+        <w:rPr>
+          <w:rFonts w:ascii="Times New Roman" w:hAnsi="Times New Roman" w:eastAsia="宋体"/>
+          <w:sz w:val="24"/>
+        </w:rPr>
         <w:t xml:space="preserve">— </w:t>
       </w:r>
       <w:r>
         <w:rPr>
-          <w:rFonts w:hint="eastAsia"/>
+          <w:rFonts w:hint="eastAsia" w:ascii="Times New Roman" w:hAnsi="Times New Roman" w:eastAsia="宋体"/>
+          <w:sz w:val="24"/>
         </w:rPr>
         <w:t xml:space="preserve">全栈架构与产品定位</w:t>
       </w:r>
@@ -536,6 +667,7 @@
     <w:p>
       <w:pPr>
         <w:pStyle w:val="ImageCaption"/>
+        <w:spacing w:line="360" w:lineRule="auto"/>
         <w:jc w:val="center"/>
       </w:pPr>
       <w:r>
@@ -572,15 +704,15 @@
     <w:tbl>
       <w:tblPr>
         <w:tblStyle w:val="Table"/>
-        <w:tblW w:type="dxa" w:w="9070"/>
+        <w:tblW w:type="dxa" w:w="8305"/>
         <w:jc w:val="center"/>
         <w:tblLayout w:type="fixed"/>
         <w:tblLook w:firstRow="1" w:lastRow="0" w:firstColumn="0" w:lastColumn="0" w:noHBand="0" w:noVBand="0" w:val="0020"/>
       </w:tblPr>
       <w:tblGrid>
-        <w:gridCol w:w="3023"/>
-        <w:gridCol w:w="3023"/>
-        <w:gridCol w:w="3024"/>
+        <w:gridCol w:w="2768"/>
+        <w:gridCol w:w="2768"/>
+        <w:gridCol w:w="2769"/>
       </w:tblGrid>
       <w:tr>
         <w:trPr>
@@ -589,7 +721,7 @@
         <w:tc>
           <w:tcPr>
             <w:shd w:val="clear" w:color="auto" w:fill="2E5A9C"/>
-            <w:tcW w:type="dxa" w:w="3023"/>
+            <w:tcW w:type="dxa" w:w="2768"/>
             <w:tcBorders>
               <w:top w:val="single" w:sz="8" w:color="2E5A9C"/>
               <w:left w:val="single" w:sz="8" w:color="2E5A9C"/>
@@ -617,7 +749,7 @@
         <w:tc>
           <w:tcPr>
             <w:shd w:val="clear" w:color="auto" w:fill="2E5A9C"/>
-            <w:tcW w:type="dxa" w:w="3023"/>
+            <w:tcW w:type="dxa" w:w="2768"/>
             <w:tcBorders>
               <w:top w:val="single" w:sz="8" w:color="2E5A9C"/>
               <w:left w:val="single" w:sz="8" w:color="2E5A9C"/>
@@ -663,7 +795,7 @@
         <w:tc>
           <w:tcPr>
             <w:shd w:val="clear" w:color="auto" w:fill="2E5A9C"/>
-            <w:tcW w:type="dxa" w:w="3024"/>
+            <w:tcW w:type="dxa" w:w="2769"/>
             <w:tcBorders>
               <w:top w:val="single" w:sz="8" w:color="2E5A9C"/>
               <w:left w:val="single" w:sz="8" w:color="2E5A9C"/>
@@ -692,7 +824,7 @@
       <w:tr>
         <w:tc>
           <w:tcPr>
-            <w:tcW w:type="dxa" w:w="3023"/>
+            <w:tcW w:type="dxa" w:w="2768"/>
             <w:tcBorders>
               <w:top w:val="single" w:sz="4" w:color="E5E7EB"/>
               <w:left w:val="single" w:sz="4" w:color="E5E7EB"/>
@@ -717,7 +849,7 @@
         </w:tc>
         <w:tc>
           <w:tcPr>
-            <w:tcW w:type="dxa" w:w="3023"/>
+            <w:tcW w:type="dxa" w:w="2768"/>
             <w:tcBorders>
               <w:top w:val="single" w:sz="4" w:color="E5E7EB"/>
               <w:left w:val="single" w:sz="4" w:color="E5E7EB"/>
@@ -763,7 +895,7 @@
         </w:tc>
         <w:tc>
           <w:tcPr>
-            <w:tcW w:type="dxa" w:w="3024"/>
+            <w:tcW w:type="dxa" w:w="2769"/>
             <w:tcBorders>
               <w:top w:val="single" w:sz="4" w:color="E5E7EB"/>
               <w:left w:val="single" w:sz="4" w:color="E5E7EB"/>
@@ -790,7 +922,7 @@
       <w:tr>
         <w:tc>
           <w:tcPr>
-            <w:tcW w:type="dxa" w:w="3023"/>
+            <w:tcW w:type="dxa" w:w="2768"/>
             <w:tcBorders>
               <w:top w:val="single" w:sz="4" w:color="E5E7EB"/>
               <w:left w:val="single" w:sz="4" w:color="E5E7EB"/>
@@ -822,7 +954,7 @@
         </w:tc>
         <w:tc>
           <w:tcPr>
-            <w:tcW w:type="dxa" w:w="3023"/>
+            <w:tcW w:type="dxa" w:w="2768"/>
             <w:tcBorders>
               <w:top w:val="single" w:sz="4" w:color="E5E7EB"/>
               <w:left w:val="single" w:sz="4" w:color="E5E7EB"/>
@@ -854,7 +986,7 @@
         </w:tc>
         <w:tc>
           <w:tcPr>
-            <w:tcW w:type="dxa" w:w="3024"/>
+            <w:tcW w:type="dxa" w:w="2769"/>
             <w:tcBorders>
               <w:top w:val="single" w:sz="4" w:color="E5E7EB"/>
               <w:left w:val="single" w:sz="4" w:color="E5E7EB"/>
@@ -909,7 +1041,7 @@
       <w:tr>
         <w:tc>
           <w:tcPr>
-            <w:tcW w:type="dxa" w:w="3023"/>
+            <w:tcW w:type="dxa" w:w="2768"/>
             <w:tcBorders>
               <w:top w:val="single" w:sz="4" w:color="E5E7EB"/>
               <w:left w:val="single" w:sz="4" w:color="E5E7EB"/>
@@ -934,7 +1066,7 @@
         </w:tc>
         <w:tc>
           <w:tcPr>
-            <w:tcW w:type="dxa" w:w="3023"/>
+            <w:tcW w:type="dxa" w:w="2768"/>
             <w:tcBorders>
               <w:top w:val="single" w:sz="4" w:color="E5E7EB"/>
               <w:left w:val="single" w:sz="4" w:color="E5E7EB"/>
@@ -973,7 +1105,7 @@
         </w:tc>
         <w:tc>
           <w:tcPr>
-            <w:tcW w:type="dxa" w:w="3024"/>
+            <w:tcW w:type="dxa" w:w="2769"/>
             <w:tcBorders>
               <w:top w:val="single" w:sz="4" w:color="E5E7EB"/>
               <w:left w:val="single" w:sz="4" w:color="E5E7EB"/>
@@ -1000,7 +1132,7 @@
       <w:tr>
         <w:tc>
           <w:tcPr>
-            <w:tcW w:type="dxa" w:w="3023"/>
+            <w:tcW w:type="dxa" w:w="2768"/>
             <w:tcBorders>
               <w:top w:val="single" w:sz="4" w:color="E5E7EB"/>
               <w:left w:val="single" w:sz="4" w:color="E5E7EB"/>
@@ -1025,7 +1157,7 @@
         </w:tc>
         <w:tc>
           <w:tcPr>
-            <w:tcW w:type="dxa" w:w="3023"/>
+            <w:tcW w:type="dxa" w:w="2768"/>
             <w:tcBorders>
               <w:top w:val="single" w:sz="4" w:color="E5E7EB"/>
               <w:left w:val="single" w:sz="4" w:color="E5E7EB"/>
@@ -1050,7 +1182,7 @@
         </w:tc>
         <w:tc>
           <w:tcPr>
-            <w:tcW w:type="dxa" w:w="3024"/>
+            <w:tcW w:type="dxa" w:w="2769"/>
             <w:tcBorders>
               <w:top w:val="single" w:sz="4" w:color="E5E7EB"/>
               <w:left w:val="single" w:sz="4" w:color="E5E7EB"/>
@@ -1105,7 +1237,7 @@
       <w:tr>
         <w:tc>
           <w:tcPr>
-            <w:tcW w:type="dxa" w:w="3023"/>
+            <w:tcW w:type="dxa" w:w="2768"/>
             <w:tcBorders>
               <w:top w:val="single" w:sz="4" w:color="E5E7EB"/>
               <w:left w:val="single" w:sz="4" w:color="E5E7EB"/>
@@ -1130,7 +1262,7 @@
         </w:tc>
         <w:tc>
           <w:tcPr>
-            <w:tcW w:type="dxa" w:w="3023"/>
+            <w:tcW w:type="dxa" w:w="2768"/>
             <w:tcBorders>
               <w:top w:val="single" w:sz="4" w:color="E5E7EB"/>
               <w:left w:val="single" w:sz="4" w:color="E5E7EB"/>
@@ -1190,7 +1322,7 @@
         </w:tc>
         <w:tc>
           <w:tcPr>
-            <w:tcW w:type="dxa" w:w="3024"/>
+            <w:tcW w:type="dxa" w:w="2769"/>
             <w:tcBorders>
               <w:top w:val="single" w:sz="4" w:color="E5E7EB"/>
               <w:left w:val="single" w:sz="4" w:color="E5E7EB"/>
@@ -1283,6 +1415,7 @@
     <w:p>
       <w:pPr>
         <w:pStyle w:val="ImageCaption"/>
+        <w:spacing w:line="360" w:lineRule="auto"/>
         <w:jc w:val="center"/>
       </w:pPr>
       <w:r>
@@ -1296,14 +1429,14 @@
     <w:tbl>
       <w:tblPr>
         <w:tblStyle w:val="Table"/>
-        <w:tblW w:type="dxa" w:w="9070"/>
+        <w:tblW w:type="dxa" w:w="8305"/>
         <w:jc w:val="center"/>
         <w:tblLayout w:type="fixed"/>
         <w:tblLook w:firstRow="1" w:lastRow="0" w:firstColumn="0" w:lastColumn="0" w:noHBand="0" w:noVBand="0" w:val="0020"/>
       </w:tblPr>
       <w:tblGrid>
-        <w:gridCol w:w="4535"/>
-        <w:gridCol w:w="4535"/>
+        <w:gridCol w:w="4152"/>
+        <w:gridCol w:w="4153"/>
       </w:tblGrid>
       <w:tr>
         <w:trPr>
@@ -1312,7 +1445,7 @@
         <w:tc>
           <w:tcPr>
             <w:shd w:val="clear" w:color="auto" w:fill="2E5A9C"/>
-            <w:tcW w:type="dxa" w:w="4534"/>
+            <w:tcW w:type="dxa" w:w="4151"/>
             <w:tcBorders>
               <w:top w:val="single" w:sz="8" w:color="2E5A9C"/>
               <w:left w:val="single" w:sz="8" w:color="2E5A9C"/>
@@ -1340,7 +1473,7 @@
         <w:tc>
           <w:tcPr>
             <w:shd w:val="clear" w:color="auto" w:fill="2E5A9C"/>
-            <w:tcW w:type="dxa" w:w="4534"/>
+            <w:tcW w:type="dxa" w:w="4152"/>
             <w:tcBorders>
               <w:top w:val="single" w:sz="8" w:color="2E5A9C"/>
               <w:left w:val="single" w:sz="8" w:color="2E5A9C"/>
@@ -1369,7 +1502,7 @@
       <w:tr>
         <w:tc>
           <w:tcPr>
-            <w:tcW w:type="dxa" w:w="4534"/>
+            <w:tcW w:type="dxa" w:w="4151"/>
             <w:tcBorders>
               <w:top w:val="single" w:sz="4" w:color="E5E7EB"/>
               <w:left w:val="single" w:sz="4" w:color="E5E7EB"/>
@@ -1394,7 +1527,7 @@
         </w:tc>
         <w:tc>
           <w:tcPr>
-            <w:tcW w:type="dxa" w:w="4534"/>
+            <w:tcW w:type="dxa" w:w="4152"/>
             <w:tcBorders>
               <w:top w:val="single" w:sz="4" w:color="E5E7EB"/>
               <w:left w:val="single" w:sz="4" w:color="E5E7EB"/>
@@ -1449,7 +1582,7 @@
       <w:tr>
         <w:tc>
           <w:tcPr>
-            <w:tcW w:type="dxa" w:w="4534"/>
+            <w:tcW w:type="dxa" w:w="4151"/>
             <w:tcBorders>
               <w:top w:val="single" w:sz="4" w:color="E5E7EB"/>
               <w:left w:val="single" w:sz="4" w:color="E5E7EB"/>
@@ -1474,7 +1607,7 @@
         </w:tc>
         <w:tc>
           <w:tcPr>
-            <w:tcW w:type="dxa" w:w="4534"/>
+            <w:tcW w:type="dxa" w:w="4152"/>
             <w:tcBorders>
               <w:top w:val="single" w:sz="4" w:color="E5E7EB"/>
               <w:left w:val="single" w:sz="4" w:color="E5E7EB"/>
@@ -1501,7 +1634,7 @@
       <w:tr>
         <w:tc>
           <w:tcPr>
-            <w:tcW w:type="dxa" w:w="4534"/>
+            <w:tcW w:type="dxa" w:w="4151"/>
             <w:tcBorders>
               <w:top w:val="single" w:sz="4" w:color="E5E7EB"/>
               <w:left w:val="single" w:sz="4" w:color="E5E7EB"/>
@@ -1533,7 +1666,7 @@
         </w:tc>
         <w:tc>
           <w:tcPr>
-            <w:tcW w:type="dxa" w:w="4534"/>
+            <w:tcW w:type="dxa" w:w="4152"/>
             <w:tcBorders>
               <w:top w:val="single" w:sz="4" w:color="E5E7EB"/>
               <w:left w:val="single" w:sz="4" w:color="E5E7EB"/>
@@ -1560,7 +1693,7 @@
       <w:tr>
         <w:tc>
           <w:tcPr>
-            <w:tcW w:type="dxa" w:w="4534"/>
+            <w:tcW w:type="dxa" w:w="4151"/>
             <w:tcBorders>
               <w:top w:val="single" w:sz="4" w:color="E5E7EB"/>
               <w:left w:val="single" w:sz="4" w:color="E5E7EB"/>
@@ -1585,7 +1718,7 @@
         </w:tc>
         <w:tc>
           <w:tcPr>
-            <w:tcW w:type="dxa" w:w="4534"/>
+            <w:tcW w:type="dxa" w:w="4152"/>
             <w:tcBorders>
               <w:top w:val="single" w:sz="4" w:color="E5E7EB"/>
               <w:left w:val="single" w:sz="4" w:color="E5E7EB"/>
@@ -1661,7 +1794,7 @@
       <w:tr>
         <w:tc>
           <w:tcPr>
-            <w:tcW w:type="dxa" w:w="4534"/>
+            <w:tcW w:type="dxa" w:w="4151"/>
             <w:tcBorders>
               <w:top w:val="single" w:sz="4" w:color="E5E7EB"/>
               <w:left w:val="single" w:sz="4" w:color="E5E7EB"/>
@@ -1686,7 +1819,7 @@
         </w:tc>
         <w:tc>
           <w:tcPr>
-            <w:tcW w:type="dxa" w:w="4534"/>
+            <w:tcW w:type="dxa" w:w="4152"/>
             <w:tcBorders>
               <w:top w:val="single" w:sz="4" w:color="E5E7EB"/>
               <w:left w:val="single" w:sz="4" w:color="E5E7EB"/>
@@ -1748,7 +1881,7 @@
       <w:tr>
         <w:tc>
           <w:tcPr>
-            <w:tcW w:type="dxa" w:w="4534"/>
+            <w:tcW w:type="dxa" w:w="4151"/>
             <w:tcBorders>
               <w:top w:val="single" w:sz="4" w:color="E5E7EB"/>
               <w:left w:val="single" w:sz="4" w:color="E5E7EB"/>
@@ -1787,7 +1920,7 @@
         </w:tc>
         <w:tc>
           <w:tcPr>
-            <w:tcW w:type="dxa" w:w="4534"/>
+            <w:tcW w:type="dxa" w:w="4152"/>
             <w:tcBorders>
               <w:top w:val="single" w:sz="4" w:color="E5E7EB"/>
               <w:left w:val="single" w:sz="4" w:color="E5E7EB"/>
@@ -1842,7 +1975,7 @@
       <w:tr>
         <w:tc>
           <w:tcPr>
-            <w:tcW w:type="dxa" w:w="4534"/>
+            <w:tcW w:type="dxa" w:w="4151"/>
             <w:tcBorders>
               <w:top w:val="single" w:sz="4" w:color="E5E7EB"/>
               <w:left w:val="single" w:sz="4" w:color="E5E7EB"/>
@@ -1867,7 +2000,7 @@
         </w:tc>
         <w:tc>
           <w:tcPr>
-            <w:tcW w:type="dxa" w:w="4534"/>
+            <w:tcW w:type="dxa" w:w="4152"/>
             <w:tcBorders>
               <w:top w:val="single" w:sz="4" w:color="E5E7EB"/>
               <w:left w:val="single" w:sz="4" w:color="E5E7EB"/>
@@ -1993,6 +2126,7 @@
     <w:p>
       <w:pPr>
         <w:pStyle w:val="ImageCaption"/>
+        <w:spacing w:line="360" w:lineRule="auto"/>
         <w:jc w:val="center"/>
       </w:pPr>
       <w:r>
@@ -2053,6 +2187,7 @@
     <w:p>
       <w:pPr>
         <w:pStyle w:val="ImageCaption"/>
+        <w:spacing w:line="360" w:lineRule="auto"/>
         <w:jc w:val="center"/>
       </w:pPr>
       <w:r>
@@ -2066,14 +2201,14 @@
     <w:tbl>
       <w:tblPr>
         <w:tblStyle w:val="Table"/>
-        <w:tblW w:type="dxa" w:w="9070"/>
+        <w:tblW w:type="dxa" w:w="8305"/>
         <w:jc w:val="center"/>
         <w:tblLayout w:type="fixed"/>
         <w:tblLook w:firstRow="1" w:lastRow="0" w:firstColumn="0" w:lastColumn="0" w:noHBand="0" w:noVBand="0" w:val="0020"/>
       </w:tblPr>
       <w:tblGrid>
-        <w:gridCol w:w="4535"/>
-        <w:gridCol w:w="4535"/>
+        <w:gridCol w:w="4152"/>
+        <w:gridCol w:w="4153"/>
       </w:tblGrid>
       <w:tr>
         <w:trPr>
@@ -2082,7 +2217,7 @@
         <w:tc>
           <w:tcPr>
             <w:shd w:val="clear" w:color="auto" w:fill="2E5A9C"/>
-            <w:tcW w:type="dxa" w:w="4534"/>
+            <w:tcW w:type="dxa" w:w="4151"/>
             <w:tcBorders>
               <w:top w:val="single" w:sz="8" w:color="2E5A9C"/>
               <w:left w:val="single" w:sz="8" w:color="2E5A9C"/>
@@ -2110,7 +2245,7 @@
         <w:tc>
           <w:tcPr>
             <w:shd w:val="clear" w:color="auto" w:fill="2E5A9C"/>
-            <w:tcW w:type="dxa" w:w="4534"/>
+            <w:tcW w:type="dxa" w:w="4152"/>
             <w:tcBorders>
               <w:top w:val="single" w:sz="8" w:color="2E5A9C"/>
               <w:left w:val="single" w:sz="8" w:color="2E5A9C"/>
@@ -2139,7 +2274,7 @@
       <w:tr>
         <w:tc>
           <w:tcPr>
-            <w:tcW w:type="dxa" w:w="4534"/>
+            <w:tcW w:type="dxa" w:w="4151"/>
             <w:tcBorders>
               <w:top w:val="single" w:sz="4" w:color="E5E7EB"/>
               <w:left w:val="single" w:sz="4" w:color="E5E7EB"/>
@@ -2164,7 +2299,7 @@
         </w:tc>
         <w:tc>
           <w:tcPr>
-            <w:tcW w:type="dxa" w:w="4534"/>
+            <w:tcW w:type="dxa" w:w="4152"/>
             <w:tcBorders>
               <w:top w:val="single" w:sz="4" w:color="E5E7EB"/>
               <w:left w:val="single" w:sz="4" w:color="E5E7EB"/>
@@ -2205,7 +2340,7 @@
       <w:tr>
         <w:tc>
           <w:tcPr>
-            <w:tcW w:type="dxa" w:w="4534"/>
+            <w:tcW w:type="dxa" w:w="4151"/>
             <w:tcBorders>
               <w:top w:val="single" w:sz="4" w:color="E5E7EB"/>
               <w:left w:val="single" w:sz="4" w:color="E5E7EB"/>
@@ -2230,7 +2365,7 @@
         </w:tc>
         <w:tc>
           <w:tcPr>
-            <w:tcW w:type="dxa" w:w="4534"/>
+            <w:tcW w:type="dxa" w:w="4152"/>
             <w:tcBorders>
               <w:top w:val="single" w:sz="4" w:color="E5E7EB"/>
               <w:left w:val="single" w:sz="4" w:color="E5E7EB"/>
@@ -2271,7 +2406,7 @@
       <w:tr>
         <w:tc>
           <w:tcPr>
-            <w:tcW w:type="dxa" w:w="4534"/>
+            <w:tcW w:type="dxa" w:w="4151"/>
             <w:tcBorders>
               <w:top w:val="single" w:sz="4" w:color="E5E7EB"/>
               <w:left w:val="single" w:sz="4" w:color="E5E7EB"/>
@@ -2296,7 +2431,7 @@
         </w:tc>
         <w:tc>
           <w:tcPr>
-            <w:tcW w:type="dxa" w:w="4534"/>
+            <w:tcW w:type="dxa" w:w="4152"/>
             <w:tcBorders>
               <w:top w:val="single" w:sz="4" w:color="E5E7EB"/>
               <w:left w:val="single" w:sz="4" w:color="E5E7EB"/>
@@ -2330,7 +2465,7 @@
       <w:tr>
         <w:tc>
           <w:tcPr>
-            <w:tcW w:type="dxa" w:w="4534"/>
+            <w:tcW w:type="dxa" w:w="4151"/>
             <w:tcBorders>
               <w:top w:val="single" w:sz="4" w:color="E5E7EB"/>
               <w:left w:val="single" w:sz="4" w:color="E5E7EB"/>
@@ -2355,7 +2490,7 @@
         </w:tc>
         <w:tc>
           <w:tcPr>
-            <w:tcW w:type="dxa" w:w="4534"/>
+            <w:tcW w:type="dxa" w:w="4152"/>
             <w:tcBorders>
               <w:top w:val="single" w:sz="4" w:color="E5E7EB"/>
               <w:left w:val="single" w:sz="4" w:color="E5E7EB"/>
@@ -2389,7 +2524,7 @@
       <w:tr>
         <w:tc>
           <w:tcPr>
-            <w:tcW w:type="dxa" w:w="4534"/>
+            <w:tcW w:type="dxa" w:w="4151"/>
             <w:tcBorders>
               <w:top w:val="single" w:sz="4" w:color="E5E7EB"/>
               <w:left w:val="single" w:sz="4" w:color="E5E7EB"/>
@@ -2414,7 +2549,7 @@
         </w:tc>
         <w:tc>
           <w:tcPr>
-            <w:tcW w:type="dxa" w:w="4534"/>
+            <w:tcW w:type="dxa" w:w="4152"/>
             <w:tcBorders>
               <w:top w:val="single" w:sz="4" w:color="E5E7EB"/>
               <w:left w:val="single" w:sz="4" w:color="E5E7EB"/>
@@ -2455,7 +2590,7 @@
       <w:tr>
         <w:tc>
           <w:tcPr>
-            <w:tcW w:type="dxa" w:w="4534"/>
+            <w:tcW w:type="dxa" w:w="4151"/>
             <w:tcBorders>
               <w:top w:val="single" w:sz="4" w:color="E5E7EB"/>
               <w:left w:val="single" w:sz="4" w:color="E5E7EB"/>
@@ -2480,7 +2615,7 @@
         </w:tc>
         <w:tc>
           <w:tcPr>
-            <w:tcW w:type="dxa" w:w="4534"/>
+            <w:tcW w:type="dxa" w:w="4152"/>
             <w:tcBorders>
               <w:top w:val="single" w:sz="4" w:color="E5E7EB"/>
               <w:left w:val="single" w:sz="4" w:color="E5E7EB"/>
@@ -2535,7 +2670,7 @@
       <w:tr>
         <w:tc>
           <w:tcPr>
-            <w:tcW w:type="dxa" w:w="4534"/>
+            <w:tcW w:type="dxa" w:w="4151"/>
             <w:tcBorders>
               <w:top w:val="single" w:sz="4" w:color="E5E7EB"/>
               <w:left w:val="single" w:sz="4" w:color="E5E7EB"/>
@@ -2560,7 +2695,7 @@
         </w:tc>
         <w:tc>
           <w:tcPr>
-            <w:tcW w:type="dxa" w:w="4534"/>
+            <w:tcW w:type="dxa" w:w="4152"/>
             <w:tcBorders>
               <w:top w:val="single" w:sz="4" w:color="E5E7EB"/>
               <w:left w:val="single" w:sz="4" w:color="E5E7EB"/>
@@ -2587,7 +2722,7 @@
       <w:tr>
         <w:tc>
           <w:tcPr>
-            <w:tcW w:type="dxa" w:w="4534"/>
+            <w:tcW w:type="dxa" w:w="4151"/>
             <w:tcBorders>
               <w:top w:val="single" w:sz="4" w:color="E5E7EB"/>
               <w:left w:val="single" w:sz="4" w:color="E5E7EB"/>
@@ -2612,7 +2747,7 @@
         </w:tc>
         <w:tc>
           <w:tcPr>
-            <w:tcW w:type="dxa" w:w="4534"/>
+            <w:tcW w:type="dxa" w:w="4152"/>
             <w:tcBorders>
               <w:top w:val="single" w:sz="4" w:color="E5E7EB"/>
               <w:left w:val="single" w:sz="4" w:color="E5E7EB"/>
@@ -2646,7 +2781,7 @@
       <w:tr>
         <w:tc>
           <w:tcPr>
-            <w:tcW w:type="dxa" w:w="4534"/>
+            <w:tcW w:type="dxa" w:w="4151"/>
             <w:tcBorders>
               <w:top w:val="single" w:sz="4" w:color="E5E7EB"/>
               <w:left w:val="single" w:sz="4" w:color="E5E7EB"/>
@@ -2671,7 +2806,7 @@
         </w:tc>
         <w:tc>
           <w:tcPr>
-            <w:tcW w:type="dxa" w:w="4534"/>
+            <w:tcW w:type="dxa" w:w="4152"/>
             <w:tcBorders>
               <w:top w:val="single" w:sz="4" w:color="E5E7EB"/>
               <w:left w:val="single" w:sz="4" w:color="E5E7EB"/>
@@ -2712,7 +2847,7 @@
       <w:tr>
         <w:tc>
           <w:tcPr>
-            <w:tcW w:type="dxa" w:w="4534"/>
+            <w:tcW w:type="dxa" w:w="4151"/>
             <w:tcBorders>
               <w:top w:val="single" w:sz="4" w:color="E5E7EB"/>
               <w:left w:val="single" w:sz="4" w:color="E5E7EB"/>
@@ -2737,7 +2872,7 @@
         </w:tc>
         <w:tc>
           <w:tcPr>
-            <w:tcW w:type="dxa" w:w="4534"/>
+            <w:tcW w:type="dxa" w:w="4152"/>
             <w:tcBorders>
               <w:top w:val="single" w:sz="4" w:color="E5E7EB"/>
               <w:left w:val="single" w:sz="4" w:color="E5E7EB"/>
@@ -2765,56 +2900,74 @@
     <w:p>
       <w:pPr>
         <w:pStyle w:val="BodyText"/>
-      </w:pPr>
-      <w:r>
-        <w:rPr>
-          <w:rFonts w:hint="eastAsia"/>
+        <w:spacing w:line="360" w:lineRule="auto"/>
+      </w:pPr>
+      <w:r>
+        <w:rPr>
+          <w:rFonts w:hint="eastAsia" w:ascii="Times New Roman" w:hAnsi="Times New Roman" w:eastAsia="宋体"/>
+          <w:sz w:val="24"/>
         </w:rPr>
         <w:t xml:space="preserve">该</w:t>
       </w:r>
       <w:r>
+        <w:rPr>
+          <w:rFonts w:ascii="Times New Roman" w:hAnsi="Times New Roman" w:eastAsia="宋体"/>
+          <w:sz w:val="24"/>
+        </w:rPr>
         <w:t xml:space="preserve"> sEMG </w:t>
       </w:r>
       <w:r>
         <w:rPr>
-          <w:rFonts w:hint="eastAsia"/>
+          <w:rFonts w:hint="eastAsia" w:ascii="Times New Roman" w:hAnsi="Times New Roman" w:eastAsia="宋体"/>
+          <w:sz w:val="24"/>
         </w:rPr>
         <w:t xml:space="preserve">模块的信号放大与采集电路设计，与表面肌电测试电路、高共模抑制比肌电传感器电路及数字传感器设计的经典方案一致</w:t>
       </w:r>
       <w:r>
         <w:rPr>
+          <w:rFonts w:ascii="Times New Roman" w:hAnsi="Times New Roman" w:eastAsia="宋体"/>
+          <w:sz w:val="24"/>
           <w:vertAlign w:val="superscript"/>
         </w:rPr>
         <w:t xml:space="preserve">[3,4,5]</w:t>
       </w:r>
       <w:r>
+        <w:rPr>
+          <w:rFonts w:ascii="Times New Roman" w:hAnsi="Times New Roman" w:eastAsia="宋体"/>
+          <w:sz w:val="24"/>
+        </w:rPr>
         <w:t xml:space="preserve">。</w:t>
       </w:r>
     </w:p>
     <w:p>
       <w:pPr>
         <w:pStyle w:val="BodyText"/>
-      </w:pPr>
-      <w:r>
-        <w:rPr>
-          <w:rFonts w:hint="eastAsia"/>
+        <w:spacing w:line="360" w:lineRule="auto"/>
+      </w:pPr>
+      <w:r>
+        <w:rPr>
+          <w:rFonts w:hint="eastAsia" w:ascii="Times New Roman" w:hAnsi="Times New Roman" w:eastAsia="宋体"/>
           <w:b/>
           <w:bCs/>
+          <w:sz w:val="24"/>
         </w:rPr>
         <w:t xml:space="preserve">关键信号量级（传感器实测输出，以</w:t>
       </w:r>
       <w:r>
         <w:rPr>
+          <w:rFonts w:ascii="Times New Roman" w:hAnsi="Times New Roman" w:eastAsia="宋体"/>
           <w:b/>
           <w:bCs/>
+          <w:sz w:val="24"/>
         </w:rPr>
         <w:t xml:space="preserve"> 1.5V </w:t>
       </w:r>
       <w:r>
         <w:rPr>
-          <w:rFonts w:hint="eastAsia"/>
+          <w:rFonts w:hint="eastAsia" w:ascii="Times New Roman" w:hAnsi="Times New Roman" w:eastAsia="宋体"/>
           <w:b/>
           <w:bCs/>
+          <w:sz w:val="24"/>
         </w:rPr>
         <w:t xml:space="preserve">为基准）：</w:t>
       </w:r>
@@ -2822,14 +2975,14 @@
     <w:tbl>
       <w:tblPr>
         <w:tblStyle w:val="Table"/>
-        <w:tblW w:type="dxa" w:w="9070"/>
+        <w:tblW w:type="dxa" w:w="8305"/>
         <w:jc w:val="center"/>
         <w:tblLayout w:type="fixed"/>
         <w:tblLook w:firstRow="1" w:lastRow="0" w:firstColumn="0" w:lastColumn="0" w:noHBand="0" w:noVBand="0" w:val="0020"/>
       </w:tblPr>
       <w:tblGrid>
-        <w:gridCol w:w="4535"/>
-        <w:gridCol w:w="4535"/>
+        <w:gridCol w:w="4152"/>
+        <w:gridCol w:w="4153"/>
       </w:tblGrid>
       <w:tr>
         <w:trPr>
@@ -2838,7 +2991,7 @@
         <w:tc>
           <w:tcPr>
             <w:shd w:val="clear" w:color="auto" w:fill="2E5A9C"/>
-            <w:tcW w:type="dxa" w:w="4534"/>
+            <w:tcW w:type="dxa" w:w="4151"/>
             <w:tcBorders>
               <w:top w:val="single" w:sz="8" w:color="2E5A9C"/>
               <w:left w:val="single" w:sz="8" w:color="2E5A9C"/>
@@ -2866,7 +3019,7 @@
         <w:tc>
           <w:tcPr>
             <w:shd w:val="clear" w:color="auto" w:fill="2E5A9C"/>
-            <w:tcW w:type="dxa" w:w="4534"/>
+            <w:tcW w:type="dxa" w:w="4152"/>
             <w:tcBorders>
               <w:top w:val="single" w:sz="8" w:color="2E5A9C"/>
               <w:left w:val="single" w:sz="8" w:color="2E5A9C"/>
@@ -2895,7 +3048,7 @@
       <w:tr>
         <w:tc>
           <w:tcPr>
-            <w:tcW w:type="dxa" w:w="4534"/>
+            <w:tcW w:type="dxa" w:w="4151"/>
             <w:tcBorders>
               <w:top w:val="single" w:sz="4" w:color="E5E7EB"/>
               <w:left w:val="single" w:sz="4" w:color="E5E7EB"/>
@@ -2920,7 +3073,7 @@
         </w:tc>
         <w:tc>
           <w:tcPr>
-            <w:tcW w:type="dxa" w:w="4534"/>
+            <w:tcW w:type="dxa" w:w="4152"/>
             <w:tcBorders>
               <w:top w:val="single" w:sz="4" w:color="E5E7EB"/>
               <w:left w:val="single" w:sz="4" w:color="E5E7EB"/>
@@ -2947,7 +3100,7 @@
       <w:tr>
         <w:tc>
           <w:tcPr>
-            <w:tcW w:type="dxa" w:w="4534"/>
+            <w:tcW w:type="dxa" w:w="4151"/>
             <w:tcBorders>
               <w:top w:val="single" w:sz="4" w:color="E5E7EB"/>
               <w:left w:val="single" w:sz="4" w:color="E5E7EB"/>
@@ -2972,7 +3125,7 @@
         </w:tc>
         <w:tc>
           <w:tcPr>
-            <w:tcW w:type="dxa" w:w="4534"/>
+            <w:tcW w:type="dxa" w:w="4152"/>
             <w:tcBorders>
               <w:top w:val="single" w:sz="4" w:color="E5E7EB"/>
               <w:left w:val="single" w:sz="4" w:color="E5E7EB"/>
@@ -2999,7 +3152,7 @@
       <w:tr>
         <w:tc>
           <w:tcPr>
-            <w:tcW w:type="dxa" w:w="4534"/>
+            <w:tcW w:type="dxa" w:w="4151"/>
             <w:tcBorders>
               <w:top w:val="single" w:sz="4" w:color="E5E7EB"/>
               <w:left w:val="single" w:sz="4" w:color="E5E7EB"/>
@@ -3031,7 +3184,7 @@
         </w:tc>
         <w:tc>
           <w:tcPr>
-            <w:tcW w:type="dxa" w:w="4534"/>
+            <w:tcW w:type="dxa" w:w="4152"/>
             <w:tcBorders>
               <w:top w:val="single" w:sz="4" w:color="E5E7EB"/>
               <w:left w:val="single" w:sz="4" w:color="E5E7EB"/>
@@ -3059,85 +3212,114 @@
     <w:p>
       <w:pPr>
         <w:pStyle w:val="BlockText"/>
-      </w:pPr>
-      <w:r>
-        <w:rPr>
-          <w:rFonts w:hint="eastAsia"/>
+        <w:spacing w:line="360" w:lineRule="auto"/>
+      </w:pPr>
+      <w:r>
+        <w:rPr>
+          <w:rFonts w:hint="eastAsia" w:ascii="Times New Roman" w:hAnsi="Times New Roman" w:eastAsia="宋体"/>
+          <w:sz w:val="24"/>
         </w:rPr>
         <w:t xml:space="preserve">可见最大发力时输出仅约</w:t>
       </w:r>
       <w:r>
+        <w:rPr>
+          <w:rFonts w:ascii="Times New Roman" w:hAnsi="Times New Roman" w:eastAsia="宋体"/>
+          <w:sz w:val="24"/>
+        </w:rPr>
         <w:t xml:space="preserve"> </w:t>
       </w:r>
       <w:r>
         <w:rPr>
-          <w:rFonts w:hint="eastAsia"/>
+          <w:rFonts w:hint="eastAsia" w:ascii="Times New Roman" w:hAnsi="Times New Roman" w:eastAsia="宋体"/>
+          <w:sz w:val="24"/>
         </w:rPr>
         <w:t xml:space="preserve">0.5～2.5V，</w:t>
       </w:r>
       <w:r>
         <w:rPr>
-          <w:rFonts w:hint="eastAsia"/>
+          <w:rFonts w:hint="eastAsia" w:ascii="Times New Roman" w:hAnsi="Times New Roman" w:eastAsia="宋体"/>
           <w:b/>
           <w:bCs/>
+          <w:sz w:val="24"/>
         </w:rPr>
         <w:t xml:space="preserve">传感器</w:t>
       </w:r>
       <w:r>
         <w:rPr>
+          <w:rFonts w:ascii="Times New Roman" w:hAnsi="Times New Roman" w:eastAsia="宋体"/>
           <w:b/>
           <w:bCs/>
+          <w:sz w:val="24"/>
         </w:rPr>
         <w:t xml:space="preserve"> </w:t>
       </w:r>
       <w:r>
         <w:rPr>
-          <w:rFonts w:hint="eastAsia"/>
+          <w:rFonts w:hint="eastAsia" w:ascii="Times New Roman" w:hAnsi="Times New Roman" w:eastAsia="宋体"/>
           <w:b/>
           <w:bCs/>
+          <w:sz w:val="24"/>
         </w:rPr>
         <w:t xml:space="preserve">0～3.0V</w:t>
       </w:r>
       <w:r>
         <w:rPr>
+          <w:rFonts w:ascii="Times New Roman" w:hAnsi="Times New Roman" w:eastAsia="宋体"/>
           <w:b/>
           <w:bCs/>
+          <w:sz w:val="24"/>
         </w:rPr>
         <w:t xml:space="preserve"> </w:t>
       </w:r>
       <w:r>
         <w:rPr>
-          <w:rFonts w:hint="eastAsia"/>
+          <w:rFonts w:hint="eastAsia" w:ascii="Times New Roman" w:hAnsi="Times New Roman" w:eastAsia="宋体"/>
           <w:b/>
           <w:bCs/>
+          <w:sz w:val="24"/>
         </w:rPr>
         <w:t xml:space="preserve">量程大部分未用</w:t>
       </w:r>
       <w:r>
         <w:rPr>
-          <w:rFonts w:hint="eastAsia"/>
+          <w:rFonts w:hint="eastAsia" w:ascii="Times New Roman" w:hAnsi="Times New Roman" w:eastAsia="宋体"/>
+          <w:sz w:val="24"/>
         </w:rPr>
         <w:t xml:space="preserve">——这正说明增益、ADC</w:t>
       </w:r>
       <w:r>
+        <w:rPr>
+          <w:rFonts w:ascii="Times New Roman" w:hAnsi="Times New Roman" w:eastAsia="宋体"/>
+          <w:sz w:val="24"/>
+        </w:rPr>
         <w:t xml:space="preserve"> </w:t>
       </w:r>
       <w:r>
         <w:rPr>
-          <w:rFonts w:hint="eastAsia"/>
+          <w:rFonts w:hint="eastAsia" w:ascii="Times New Roman" w:hAnsi="Times New Roman" w:eastAsia="宋体"/>
+          <w:sz w:val="24"/>
         </w:rPr>
         <w:t xml:space="preserve">分辨率与逐人校准为何关键；数字化读数与校准基线（RMS_relax</w:t>
       </w:r>
       <w:r>
+        <w:rPr>
+          <w:rFonts w:ascii="Times New Roman" w:hAnsi="Times New Roman" w:eastAsia="宋体"/>
+          <w:sz w:val="24"/>
+        </w:rPr>
         <w:t xml:space="preserve"> / </w:t>
       </w:r>
       <w:r>
         <w:rPr>
-          <w:rFonts w:hint="eastAsia"/>
+          <w:rFonts w:hint="eastAsia" w:ascii="Times New Roman" w:hAnsi="Times New Roman" w:eastAsia="宋体"/>
+          <w:sz w:val="24"/>
         </w:rPr>
         <w:t xml:space="preserve">RMS_active）的对应关系见</w:t>
       </w:r>
       <w:r>
+        <w:rPr>
+          <w:rFonts w:ascii="Times New Roman" w:hAnsi="Times New Roman" w:eastAsia="宋体"/>
+          <w:sz w:val="24"/>
+        </w:rPr>
         <w:t xml:space="preserve"> </w:t>
       </w:r>
       <w:hyperlink r:id="rId10">
@@ -3150,14 +3332,23 @@
         </w:r>
       </w:hyperlink>
       <w:r>
+        <w:rPr>
+          <w:rFonts w:ascii="Times New Roman" w:hAnsi="Times New Roman" w:eastAsia="宋体"/>
+          <w:sz w:val="24"/>
+        </w:rPr>
         <w:t xml:space="preserve"> </w:t>
       </w:r>
       <w:r>
+        <w:rPr>
+          <w:rFonts w:ascii="Times New Roman" w:hAnsi="Times New Roman" w:eastAsia="宋体"/>
+          <w:sz w:val="24"/>
+        </w:rPr>
         <w:t xml:space="preserve">§3.4 </w:t>
       </w:r>
       <w:r>
         <w:rPr>
-          <w:rFonts w:hint="eastAsia"/>
+          <w:rFonts w:hint="eastAsia" w:ascii="Times New Roman" w:hAnsi="Times New Roman" w:eastAsia="宋体"/>
+          <w:sz w:val="24"/>
         </w:rPr>
         <w:t xml:space="preserve">激活度与疲劳度计算。</w:t>
       </w:r>
@@ -3165,23 +3356,34 @@
     <w:p>
       <w:pPr>
         <w:pStyle w:val="BlockText"/>
-      </w:pPr>
-      <w:r>
-        <w:rPr>
-          <w:rFonts w:hint="eastAsia"/>
+        <w:spacing w:line="360" w:lineRule="auto"/>
+      </w:pPr>
+      <w:r>
+        <w:rPr>
+          <w:rFonts w:hint="eastAsia" w:ascii="Times New Roman" w:hAnsi="Times New Roman" w:eastAsia="宋体"/>
+          <w:sz w:val="24"/>
         </w:rPr>
         <w:t xml:space="preserve">算法参数（采样率</w:t>
       </w:r>
       <w:r>
+        <w:rPr>
+          <w:rFonts w:ascii="Times New Roman" w:hAnsi="Times New Roman" w:eastAsia="宋体"/>
+          <w:sz w:val="24"/>
+        </w:rPr>
         <w:t xml:space="preserve"> / FFT </w:t>
       </w:r>
       <w:r>
         <w:rPr>
-          <w:rFonts w:hint="eastAsia"/>
+          <w:rFonts w:hint="eastAsia" w:ascii="Times New Roman" w:hAnsi="Times New Roman" w:eastAsia="宋体"/>
+          <w:sz w:val="24"/>
         </w:rPr>
         <w:t xml:space="preserve">窗口）见</w:t>
       </w:r>
       <w:r>
+        <w:rPr>
+          <w:rFonts w:ascii="Times New Roman" w:hAnsi="Times New Roman" w:eastAsia="宋体"/>
+          <w:sz w:val="24"/>
+        </w:rPr>
         <w:t xml:space="preserve"> </w:t>
       </w:r>
       <w:hyperlink r:id="rId10">
@@ -3194,14 +3396,23 @@
         </w:r>
       </w:hyperlink>
       <w:r>
+        <w:rPr>
+          <w:rFonts w:ascii="Times New Roman" w:hAnsi="Times New Roman" w:eastAsia="宋体"/>
+          <w:sz w:val="24"/>
+        </w:rPr>
         <w:t xml:space="preserve"> </w:t>
       </w:r>
       <w:r>
+        <w:rPr>
+          <w:rFonts w:ascii="Times New Roman" w:hAnsi="Times New Roman" w:eastAsia="宋体"/>
+          <w:sz w:val="24"/>
+        </w:rPr>
         <w:t xml:space="preserve">§3.6 </w:t>
       </w:r>
       <w:r>
         <w:rPr>
-          <w:rFonts w:hint="eastAsia"/>
+          <w:rFonts w:hint="eastAsia" w:ascii="Times New Roman" w:hAnsi="Times New Roman" w:eastAsia="宋体"/>
+          <w:sz w:val="24"/>
         </w:rPr>
         <w:t xml:space="preserve">算法参数汇总；传感器官方资料：</w:t>
       </w:r>
@@ -3215,6 +3426,10 @@
         </w:r>
       </w:hyperlink>
       <w:r>
+        <w:rPr>
+          <w:rFonts w:ascii="Times New Roman" w:hAnsi="Times New Roman" w:eastAsia="宋体"/>
+          <w:sz w:val="24"/>
+        </w:rPr>
         <w:t xml:space="preserve">。</w:t>
       </w:r>
     </w:p>
@@ -3237,14 +3452,14 @@
     <w:tbl>
       <w:tblPr>
         <w:tblStyle w:val="Table"/>
-        <w:tblW w:type="dxa" w:w="9070"/>
+        <w:tblW w:type="dxa" w:w="8305"/>
         <w:jc w:val="center"/>
         <w:tblLayout w:type="fixed"/>
         <w:tblLook w:firstRow="1" w:lastRow="0" w:firstColumn="0" w:lastColumn="0" w:noHBand="0" w:noVBand="0" w:val="0020"/>
       </w:tblPr>
       <w:tblGrid>
-        <w:gridCol w:w="4535"/>
-        <w:gridCol w:w="4535"/>
+        <w:gridCol w:w="4152"/>
+        <w:gridCol w:w="4153"/>
       </w:tblGrid>
       <w:tr>
         <w:trPr>
@@ -3253,7 +3468,7 @@
         <w:tc>
           <w:tcPr>
             <w:shd w:val="clear" w:color="auto" w:fill="2E5A9C"/>
-            <w:tcW w:type="dxa" w:w="4534"/>
+            <w:tcW w:type="dxa" w:w="4151"/>
             <w:tcBorders>
               <w:top w:val="single" w:sz="8" w:color="2E5A9C"/>
               <w:left w:val="single" w:sz="8" w:color="2E5A9C"/>
@@ -3281,7 +3496,7 @@
         <w:tc>
           <w:tcPr>
             <w:shd w:val="clear" w:color="auto" w:fill="2E5A9C"/>
-            <w:tcW w:type="dxa" w:w="4534"/>
+            <w:tcW w:type="dxa" w:w="4152"/>
             <w:tcBorders>
               <w:top w:val="single" w:sz="8" w:color="2E5A9C"/>
               <w:left w:val="single" w:sz="8" w:color="2E5A9C"/>
@@ -3310,7 +3525,7 @@
       <w:tr>
         <w:tc>
           <w:tcPr>
-            <w:tcW w:type="dxa" w:w="4534"/>
+            <w:tcW w:type="dxa" w:w="4151"/>
             <w:tcBorders>
               <w:top w:val="single" w:sz="4" w:color="E5E7EB"/>
               <w:left w:val="single" w:sz="4" w:color="E5E7EB"/>
@@ -3335,7 +3550,7 @@
         </w:tc>
         <w:tc>
           <w:tcPr>
-            <w:tcW w:type="dxa" w:w="4534"/>
+            <w:tcW w:type="dxa" w:w="4152"/>
             <w:tcBorders>
               <w:top w:val="single" w:sz="4" w:color="E5E7EB"/>
               <w:left w:val="single" w:sz="4" w:color="E5E7EB"/>
@@ -3362,7 +3577,7 @@
       <w:tr>
         <w:tc>
           <w:tcPr>
-            <w:tcW w:type="dxa" w:w="4534"/>
+            <w:tcW w:type="dxa" w:w="4151"/>
             <w:tcBorders>
               <w:top w:val="single" w:sz="4" w:color="E5E7EB"/>
               <w:left w:val="single" w:sz="4" w:color="E5E7EB"/>
@@ -3387,7 +3602,7 @@
         </w:tc>
         <w:tc>
           <w:tcPr>
-            <w:tcW w:type="dxa" w:w="4534"/>
+            <w:tcW w:type="dxa" w:w="4152"/>
             <w:tcBorders>
               <w:top w:val="single" w:sz="4" w:color="E5E7EB"/>
               <w:left w:val="single" w:sz="4" w:color="E5E7EB"/>
@@ -3421,7 +3636,7 @@
       <w:tr>
         <w:tc>
           <w:tcPr>
-            <w:tcW w:type="dxa" w:w="4534"/>
+            <w:tcW w:type="dxa" w:w="4151"/>
             <w:tcBorders>
               <w:top w:val="single" w:sz="4" w:color="E5E7EB"/>
               <w:left w:val="single" w:sz="4" w:color="E5E7EB"/>
@@ -3446,7 +3661,7 @@
         </w:tc>
         <w:tc>
           <w:tcPr>
-            <w:tcW w:type="dxa" w:w="4534"/>
+            <w:tcW w:type="dxa" w:w="4152"/>
             <w:tcBorders>
               <w:top w:val="single" w:sz="4" w:color="E5E7EB"/>
               <w:left w:val="single" w:sz="4" w:color="E5E7EB"/>
@@ -3494,7 +3709,7 @@
       <w:tr>
         <w:tc>
           <w:tcPr>
-            <w:tcW w:type="dxa" w:w="4534"/>
+            <w:tcW w:type="dxa" w:w="4151"/>
             <w:tcBorders>
               <w:top w:val="single" w:sz="4" w:color="E5E7EB"/>
               <w:left w:val="single" w:sz="4" w:color="E5E7EB"/>
@@ -3519,7 +3734,7 @@
         </w:tc>
         <w:tc>
           <w:tcPr>
-            <w:tcW w:type="dxa" w:w="4534"/>
+            <w:tcW w:type="dxa" w:w="4152"/>
             <w:tcBorders>
               <w:top w:val="single" w:sz="4" w:color="E5E7EB"/>
               <w:left w:val="single" w:sz="4" w:color="E5E7EB"/>
@@ -3546,7 +3761,7 @@
       <w:tr>
         <w:tc>
           <w:tcPr>
-            <w:tcW w:type="dxa" w:w="4534"/>
+            <w:tcW w:type="dxa" w:w="4151"/>
             <w:tcBorders>
               <w:top w:val="single" w:sz="4" w:color="E5E7EB"/>
               <w:left w:val="single" w:sz="4" w:color="E5E7EB"/>
@@ -3571,7 +3786,7 @@
         </w:tc>
         <w:tc>
           <w:tcPr>
-            <w:tcW w:type="dxa" w:w="4534"/>
+            <w:tcW w:type="dxa" w:w="4152"/>
             <w:tcBorders>
               <w:top w:val="single" w:sz="4" w:color="E5E7EB"/>
               <w:left w:val="single" w:sz="4" w:color="E5E7EB"/>
@@ -3638,160 +3853,245 @@
     <w:p>
       <w:pPr>
         <w:pStyle w:val="FirstParagraph"/>
-      </w:pPr>
-      <w:r>
-        <w:rPr>
-          <w:rFonts w:hint="eastAsia"/>
+        <w:spacing w:line="360" w:lineRule="auto"/>
+      </w:pPr>
+      <w:r>
+        <w:rPr>
+          <w:rFonts w:hint="eastAsia" w:ascii="Times New Roman" w:hAnsi="Times New Roman" w:eastAsia="宋体"/>
+          <w:sz w:val="24"/>
         </w:rPr>
         <w:t xml:space="preserve">人体肌肉</w:t>
       </w:r>
       <w:r>
+        <w:rPr>
+          <w:rFonts w:ascii="Times New Roman" w:hAnsi="Times New Roman" w:eastAsia="宋体"/>
+          <w:sz w:val="24"/>
+        </w:rPr>
         <w:t xml:space="preserve"> → </w:t>
       </w:r>
       <w:r>
         <w:rPr>
-          <w:rFonts w:hint="eastAsia"/>
+          <w:rFonts w:hint="eastAsia" w:ascii="Times New Roman" w:hAnsi="Times New Roman" w:eastAsia="宋体"/>
+          <w:sz w:val="24"/>
         </w:rPr>
         <w:t xml:space="preserve">干电极（DRY+、DRY-）+</w:t>
       </w:r>
       <w:r>
+        <w:rPr>
+          <w:rFonts w:ascii="Times New Roman" w:hAnsi="Times New Roman" w:eastAsia="宋体"/>
+          <w:sz w:val="24"/>
+        </w:rPr>
         <w:t xml:space="preserve"> </w:t>
       </w:r>
       <w:r>
         <w:rPr>
-          <w:rFonts w:hint="eastAsia"/>
+          <w:rFonts w:hint="eastAsia" w:ascii="Times New Roman" w:hAnsi="Times New Roman" w:eastAsia="宋体"/>
+          <w:sz w:val="24"/>
         </w:rPr>
         <w:t xml:space="preserve">参考电极（GND）</w:t>
       </w:r>
       <w:r>
+        <w:rPr>
+          <w:rFonts w:ascii="Times New Roman" w:hAnsi="Times New Roman" w:eastAsia="宋体"/>
+          <w:sz w:val="24"/>
+        </w:rPr>
         <w:t xml:space="preserve"> → sEMG </w:t>
       </w:r>
       <w:r>
         <w:rPr>
-          <w:rFonts w:hint="eastAsia"/>
+          <w:rFonts w:hint="eastAsia" w:ascii="Times New Roman" w:hAnsi="Times New Roman" w:eastAsia="宋体"/>
+          <w:sz w:val="24"/>
         </w:rPr>
         <w:t xml:space="preserve">传感器（滤波</w:t>
       </w:r>
       <w:r>
+        <w:rPr>
+          <w:rFonts w:ascii="Times New Roman" w:hAnsi="Times New Roman" w:eastAsia="宋体"/>
+          <w:sz w:val="24"/>
+        </w:rPr>
         <w:t xml:space="preserve"> + 1000 </w:t>
       </w:r>
       <w:r>
         <w:rPr>
-          <w:rFonts w:hint="eastAsia"/>
+          <w:rFonts w:hint="eastAsia" w:ascii="Times New Roman" w:hAnsi="Times New Roman" w:eastAsia="宋体"/>
+          <w:sz w:val="24"/>
         </w:rPr>
         <w:t xml:space="preserve">倍放大，高共模抑制比电路抑制工频干扰，输出</w:t>
       </w:r>
       <w:r>
+        <w:rPr>
+          <w:rFonts w:ascii="Times New Roman" w:hAnsi="Times New Roman" w:eastAsia="宋体"/>
+          <w:sz w:val="24"/>
+        </w:rPr>
         <w:t xml:space="preserve"> </w:t>
       </w:r>
       <w:r>
         <w:rPr>
-          <w:rFonts w:hint="eastAsia"/>
+          <w:rFonts w:hint="eastAsia" w:ascii="Times New Roman" w:hAnsi="Times New Roman" w:eastAsia="宋体"/>
+          <w:sz w:val="24"/>
         </w:rPr>
         <w:t xml:space="preserve">0～3.0V</w:t>
       </w:r>
       <w:r>
+        <w:rPr>
+          <w:rFonts w:ascii="Times New Roman" w:hAnsi="Times New Roman" w:eastAsia="宋体"/>
+          <w:sz w:val="24"/>
+        </w:rPr>
         <w:t xml:space="preserve"> </w:t>
       </w:r>
       <w:r>
         <w:rPr>
-          <w:rFonts w:hint="eastAsia"/>
+          <w:rFonts w:hint="eastAsia" w:ascii="Times New Roman" w:hAnsi="Times New Roman" w:eastAsia="宋体"/>
+          <w:sz w:val="24"/>
         </w:rPr>
         <w:t xml:space="preserve">模拟信号）</w:t>
       </w:r>
       <w:r>
         <w:rPr>
+          <w:rFonts w:ascii="Times New Roman" w:hAnsi="Times New Roman" w:eastAsia="宋体"/>
+          <w:sz w:val="24"/>
           <w:vertAlign w:val="superscript"/>
         </w:rPr>
         <w:t xml:space="preserve">[3,4,5]</w:t>
       </w:r>
       <w:r>
+        <w:rPr>
+          <w:rFonts w:ascii="Times New Roman" w:hAnsi="Times New Roman" w:eastAsia="宋体"/>
+          <w:sz w:val="24"/>
+        </w:rPr>
         <w:t xml:space="preserve"> </w:t>
       </w:r>
       <w:r>
+        <w:rPr>
+          <w:rFonts w:ascii="Times New Roman" w:hAnsi="Times New Roman" w:eastAsia="宋体"/>
+          <w:sz w:val="24"/>
+        </w:rPr>
         <w:t xml:space="preserve">→ Arduino UNO R4 WiFi </w:t>
       </w:r>
       <w:r>
         <w:rPr>
-          <w:rFonts w:hint="eastAsia"/>
+          <w:rFonts w:hint="eastAsia" w:ascii="Times New Roman" w:hAnsi="Times New Roman" w:eastAsia="宋体"/>
+          <w:sz w:val="24"/>
         </w:rPr>
         <w:t xml:space="preserve">引脚</w:t>
       </w:r>
       <w:r>
+        <w:rPr>
+          <w:rFonts w:ascii="Times New Roman" w:hAnsi="Times New Roman" w:eastAsia="宋体"/>
+          <w:sz w:val="24"/>
+        </w:rPr>
         <w:t xml:space="preserve"> </w:t>
       </w:r>
       <w:r>
         <w:rPr>
-          <w:rFonts w:hint="eastAsia"/>
+          <w:rFonts w:hint="eastAsia" w:ascii="Times New Roman" w:hAnsi="Times New Roman" w:eastAsia="宋体"/>
+          <w:sz w:val="24"/>
         </w:rPr>
         <w:t xml:space="preserve">A0（14-bit</w:t>
       </w:r>
       <w:r>
+        <w:rPr>
+          <w:rFonts w:ascii="Times New Roman" w:hAnsi="Times New Roman" w:eastAsia="宋体"/>
+          <w:sz w:val="24"/>
+        </w:rPr>
         <w:t xml:space="preserve"> </w:t>
       </w:r>
       <w:r>
         <w:rPr>
-          <w:rFonts w:hint="eastAsia"/>
+          <w:rFonts w:hint="eastAsia" w:ascii="Times New Roman" w:hAnsi="Times New Roman" w:eastAsia="宋体"/>
+          <w:sz w:val="24"/>
         </w:rPr>
         <w:t xml:space="preserve">ADC，量程</w:t>
       </w:r>
       <w:r>
+        <w:rPr>
+          <w:rFonts w:ascii="Times New Roman" w:hAnsi="Times New Roman" w:eastAsia="宋体"/>
+          <w:sz w:val="24"/>
+        </w:rPr>
         <w:t xml:space="preserve"> </w:t>
       </w:r>
       <w:r>
         <w:rPr>
-          <w:rFonts w:hint="eastAsia"/>
+          <w:rFonts w:hint="eastAsia" w:ascii="Times New Roman" w:hAnsi="Times New Roman" w:eastAsia="宋体"/>
+          <w:sz w:val="24"/>
         </w:rPr>
         <w:t xml:space="preserve">0～5V）</w:t>
       </w:r>
       <w:r>
+        <w:rPr>
+          <w:rFonts w:ascii="Times New Roman" w:hAnsi="Times New Roman" w:eastAsia="宋体"/>
+          <w:sz w:val="24"/>
+        </w:rPr>
         <w:t xml:space="preserve"> → </w:t>
       </w:r>
       <w:r>
         <w:rPr>
-          <w:rFonts w:hint="eastAsia"/>
+          <w:rFonts w:hint="eastAsia" w:ascii="Times New Roman" w:hAnsi="Times New Roman" w:eastAsia="宋体"/>
+          <w:sz w:val="24"/>
         </w:rPr>
         <w:t xml:space="preserve">固件算法处理（RMS</w:t>
       </w:r>
       <w:r>
+        <w:rPr>
+          <w:rFonts w:ascii="Times New Roman" w:hAnsi="Times New Roman" w:eastAsia="宋体"/>
+          <w:sz w:val="24"/>
+        </w:rPr>
         <w:t xml:space="preserve"> / FFT / MDF / </w:t>
       </w:r>
       <w:r>
         <w:rPr>
-          <w:rFonts w:hint="eastAsia"/>
+          <w:rFonts w:hint="eastAsia" w:ascii="Times New Roman" w:hAnsi="Times New Roman" w:eastAsia="宋体"/>
+          <w:sz w:val="24"/>
         </w:rPr>
         <w:t xml:space="preserve">激活度</w:t>
       </w:r>
       <w:r>
+        <w:rPr>
+          <w:rFonts w:ascii="Times New Roman" w:hAnsi="Times New Roman" w:eastAsia="宋体"/>
+          <w:sz w:val="24"/>
+        </w:rPr>
         <w:t xml:space="preserve"> / </w:t>
       </w:r>
       <w:r>
         <w:rPr>
-          <w:rFonts w:hint="eastAsia"/>
+          <w:rFonts w:hint="eastAsia" w:ascii="Times New Roman" w:hAnsi="Times New Roman" w:eastAsia="宋体"/>
+          <w:sz w:val="24"/>
         </w:rPr>
         <w:t xml:space="preserve">疲劳度）</w:t>
       </w:r>
       <w:r>
+        <w:rPr>
+          <w:rFonts w:ascii="Times New Roman" w:hAnsi="Times New Roman" w:eastAsia="宋体"/>
+          <w:sz w:val="24"/>
+        </w:rPr>
         <w:t xml:space="preserve"> → WiFi </w:t>
       </w:r>
       <w:r>
         <w:rPr>
-          <w:rFonts w:hint="eastAsia"/>
+          <w:rFonts w:hint="eastAsia" w:ascii="Times New Roman" w:hAnsi="Times New Roman" w:eastAsia="宋体"/>
+          <w:sz w:val="24"/>
         </w:rPr>
         <w:t xml:space="preserve">上传至微信云开发平台。本臂带形态的可穿戴疲劳监测设计，与何彦等</w:t>
       </w:r>
       <w:r>
         <w:rPr>
+          <w:rFonts w:ascii="Times New Roman" w:hAnsi="Times New Roman" w:eastAsia="宋体"/>
+          <w:sz w:val="24"/>
           <w:vertAlign w:val="superscript"/>
         </w:rPr>
         <w:t xml:space="preserve">[8]</w:t>
       </w:r>
       <w:r>
+        <w:rPr>
+          <w:rFonts w:ascii="Times New Roman" w:hAnsi="Times New Roman" w:eastAsia="宋体"/>
+          <w:sz w:val="24"/>
+        </w:rPr>
         <w:t xml:space="preserve"> </w:t>
       </w:r>
       <w:r>
         <w:rPr>
-          <w:rFonts w:hint="eastAsia"/>
+          <w:rFonts w:hint="eastAsia" w:ascii="Times New Roman" w:hAnsi="Times New Roman" w:eastAsia="宋体"/>
+          <w:sz w:val="24"/>
         </w:rPr>
         <w:t xml:space="preserve">健身穿戴产品肌肉疲劳模型的产品形态一致。</w:t>
       </w:r>
@@ -3799,43 +4099,64 @@
     <w:p>
       <w:pPr>
         <w:pStyle w:val="BodyText"/>
-      </w:pPr>
-      <w:r>
-        <w:rPr>
-          <w:rFonts w:hint="eastAsia"/>
+        <w:spacing w:line="360" w:lineRule="auto"/>
+      </w:pPr>
+      <w:r>
+        <w:rPr>
+          <w:rFonts w:hint="eastAsia" w:ascii="Times New Roman" w:hAnsi="Times New Roman" w:eastAsia="宋体"/>
           <w:b/>
           <w:bCs/>
+          <w:sz w:val="24"/>
         </w:rPr>
         <w:t xml:space="preserve">关键说明：</w:t>
       </w:r>
       <w:r>
+        <w:rPr>
+          <w:rFonts w:ascii="Times New Roman" w:hAnsi="Times New Roman" w:eastAsia="宋体"/>
+          <w:sz w:val="24"/>
+        </w:rPr>
         <w:t xml:space="preserve"> </w:t>
       </w:r>
       <w:r>
         <w:rPr>
-          <w:rFonts w:hint="eastAsia"/>
+          <w:rFonts w:hint="eastAsia" w:ascii="Times New Roman" w:hAnsi="Times New Roman" w:eastAsia="宋体"/>
+          <w:sz w:val="24"/>
         </w:rPr>
         <w:t xml:space="preserve">模拟信号接入</w:t>
       </w:r>
       <w:r>
+        <w:rPr>
+          <w:rFonts w:ascii="Times New Roman" w:hAnsi="Times New Roman" w:eastAsia="宋体"/>
+          <w:sz w:val="24"/>
+        </w:rPr>
         <w:t xml:space="preserve"> Arduino </w:t>
       </w:r>
       <w:r>
         <w:rPr>
-          <w:rFonts w:hint="eastAsia"/>
+          <w:rFonts w:hint="eastAsia" w:ascii="Times New Roman" w:hAnsi="Times New Roman" w:eastAsia="宋体"/>
+          <w:sz w:val="24"/>
         </w:rPr>
         <w:t xml:space="preserve">的具体接线与电平匹配（含为何无需电平转换），见</w:t>
       </w:r>
       <w:r>
+        <w:rPr>
+          <w:rFonts w:ascii="Times New Roman" w:hAnsi="Times New Roman" w:eastAsia="宋体"/>
+          <w:sz w:val="24"/>
+        </w:rPr>
         <w:t xml:space="preserve"> §3.2 </w:t>
       </w:r>
       <w:r>
         <w:rPr>
-          <w:rFonts w:hint="eastAsia"/>
+          <w:rFonts w:hint="eastAsia" w:ascii="Times New Roman" w:hAnsi="Times New Roman" w:eastAsia="宋体"/>
+          <w:sz w:val="24"/>
         </w:rPr>
         <w:t xml:space="preserve">传感器</w:t>
       </w:r>
       <w:r>
+        <w:rPr>
+          <w:rFonts w:ascii="Times New Roman" w:hAnsi="Times New Roman" w:eastAsia="宋体"/>
+          <w:sz w:val="24"/>
+        </w:rPr>
         <w:t xml:space="preserve"> → Arduino。</w:t>
       </w:r>
     </w:p>
@@ -3861,15 +4182,15 @@
     <w:tbl>
       <w:tblPr>
         <w:tblStyle w:val="Table"/>
-        <w:tblW w:type="dxa" w:w="9070"/>
+        <w:tblW w:type="dxa" w:w="8305"/>
         <w:jc w:val="center"/>
         <w:tblLayout w:type="fixed"/>
         <w:tblLook w:firstRow="1" w:lastRow="0" w:firstColumn="0" w:lastColumn="0" w:noHBand="0" w:noVBand="0" w:val="0020"/>
       </w:tblPr>
       <w:tblGrid>
-        <w:gridCol w:w="3023"/>
-        <w:gridCol w:w="3023"/>
-        <w:gridCol w:w="3024"/>
+        <w:gridCol w:w="2768"/>
+        <w:gridCol w:w="2768"/>
+        <w:gridCol w:w="2769"/>
       </w:tblGrid>
       <w:tr>
         <w:trPr>
@@ -3878,7 +4199,7 @@
         <w:tc>
           <w:tcPr>
             <w:shd w:val="clear" w:color="auto" w:fill="2E5A9C"/>
-            <w:tcW w:type="dxa" w:w="3023"/>
+            <w:tcW w:type="dxa" w:w="2768"/>
             <w:tcBorders>
               <w:top w:val="single" w:sz="8" w:color="2E5A9C"/>
               <w:left w:val="single" w:sz="8" w:color="2E5A9C"/>
@@ -3915,7 +4236,7 @@
         <w:tc>
           <w:tcPr>
             <w:shd w:val="clear" w:color="auto" w:fill="2E5A9C"/>
-            <w:tcW w:type="dxa" w:w="3023"/>
+            <w:tcW w:type="dxa" w:w="2768"/>
             <w:tcBorders>
               <w:top w:val="single" w:sz="8" w:color="2E5A9C"/>
               <w:left w:val="single" w:sz="8" w:color="2E5A9C"/>
@@ -3943,7 +4264,7 @@
         <w:tc>
           <w:tcPr>
             <w:shd w:val="clear" w:color="auto" w:fill="2E5A9C"/>
-            <w:tcW w:type="dxa" w:w="3024"/>
+            <w:tcW w:type="dxa" w:w="2769"/>
             <w:tcBorders>
               <w:top w:val="single" w:sz="8" w:color="2E5A9C"/>
               <w:left w:val="single" w:sz="8" w:color="2E5A9C"/>
@@ -3972,7 +4293,7 @@
       <w:tr>
         <w:tc>
           <w:tcPr>
-            <w:tcW w:type="dxa" w:w="3023"/>
+            <w:tcW w:type="dxa" w:w="2768"/>
             <w:tcBorders>
               <w:top w:val="single" w:sz="4" w:color="E5E7EB"/>
               <w:left w:val="single" w:sz="4" w:color="E5E7EB"/>
@@ -3997,7 +4318,7 @@
         </w:tc>
         <w:tc>
           <w:tcPr>
-            <w:tcW w:type="dxa" w:w="3023"/>
+            <w:tcW w:type="dxa" w:w="2768"/>
             <w:tcBorders>
               <w:top w:val="single" w:sz="4" w:color="E5E7EB"/>
               <w:left w:val="single" w:sz="4" w:color="E5E7EB"/>
@@ -4022,7 +4343,7 @@
         </w:tc>
         <w:tc>
           <w:tcPr>
-            <w:tcW w:type="dxa" w:w="3024"/>
+            <w:tcW w:type="dxa" w:w="2769"/>
             <w:tcBorders>
               <w:top w:val="single" w:sz="4" w:color="E5E7EB"/>
               <w:left w:val="single" w:sz="4" w:color="E5E7EB"/>
@@ -4049,7 +4370,7 @@
       <w:tr>
         <w:tc>
           <w:tcPr>
-            <w:tcW w:type="dxa" w:w="3023"/>
+            <w:tcW w:type="dxa" w:w="2768"/>
             <w:tcBorders>
               <w:top w:val="single" w:sz="4" w:color="E5E7EB"/>
               <w:left w:val="single" w:sz="4" w:color="E5E7EB"/>
@@ -4074,7 +4395,7 @@
         </w:tc>
         <w:tc>
           <w:tcPr>
-            <w:tcW w:type="dxa" w:w="3023"/>
+            <w:tcW w:type="dxa" w:w="2768"/>
             <w:tcBorders>
               <w:top w:val="single" w:sz="4" w:color="E5E7EB"/>
               <w:left w:val="single" w:sz="4" w:color="E5E7EB"/>
@@ -4099,7 +4420,7 @@
         </w:tc>
         <w:tc>
           <w:tcPr>
-            <w:tcW w:type="dxa" w:w="3024"/>
+            <w:tcW w:type="dxa" w:w="2769"/>
             <w:tcBorders>
               <w:top w:val="single" w:sz="4" w:color="E5E7EB"/>
               <w:left w:val="single" w:sz="4" w:color="E5E7EB"/>
@@ -4126,7 +4447,7 @@
       <w:tr>
         <w:tc>
           <w:tcPr>
-            <w:tcW w:type="dxa" w:w="3023"/>
+            <w:tcW w:type="dxa" w:w="2768"/>
             <w:tcBorders>
               <w:top w:val="single" w:sz="4" w:color="E5E7EB"/>
               <w:left w:val="single" w:sz="4" w:color="E5E7EB"/>
@@ -4151,7 +4472,7 @@
         </w:tc>
         <w:tc>
           <w:tcPr>
-            <w:tcW w:type="dxa" w:w="3023"/>
+            <w:tcW w:type="dxa" w:w="2768"/>
             <w:tcBorders>
               <w:top w:val="single" w:sz="4" w:color="E5E7EB"/>
               <w:left w:val="single" w:sz="4" w:color="E5E7EB"/>
@@ -4176,7 +4497,7 @@
         </w:tc>
         <w:tc>
           <w:tcPr>
-            <w:tcW w:type="dxa" w:w="3024"/>
+            <w:tcW w:type="dxa" w:w="2769"/>
             <w:tcBorders>
               <w:top w:val="single" w:sz="4" w:color="E5E7EB"/>
               <w:left w:val="single" w:sz="4" w:color="E5E7EB"/>
@@ -4204,12 +4525,14 @@
     <w:p>
       <w:pPr>
         <w:pStyle w:val="BodyText"/>
-      </w:pPr>
-      <w:r>
-        <w:rPr>
-          <w:rFonts w:hint="eastAsia"/>
+        <w:spacing w:line="360" w:lineRule="auto"/>
+      </w:pPr>
+      <w:r>
+        <w:rPr>
+          <w:rFonts w:hint="eastAsia" w:ascii="Times New Roman" w:hAnsi="Times New Roman" w:eastAsia="宋体"/>
           <w:b/>
           <w:bCs/>
+          <w:sz w:val="24"/>
         </w:rPr>
         <w:t xml:space="preserve">连接说明：</w:t>
       </w:r>
@@ -4221,55 +4544,82 @@
           <w:ilvl w:val="0"/>
           <w:numId w:val="1007"/>
         </w:numPr>
-      </w:pPr>
-      <w:r>
-        <w:rPr>
-          <w:rFonts w:hint="eastAsia"/>
+        <w:spacing w:line="360" w:lineRule="auto"/>
+      </w:pPr>
+      <w:r>
+        <w:rPr>
+          <w:rFonts w:hint="eastAsia" w:ascii="Times New Roman" w:hAnsi="Times New Roman" w:eastAsia="宋体"/>
+          <w:sz w:val="24"/>
         </w:rPr>
         <w:t xml:space="preserve">传感器输出最高</w:t>
       </w:r>
       <w:r>
+        <w:rPr>
+          <w:rFonts w:ascii="Times New Roman" w:hAnsi="Times New Roman" w:eastAsia="宋体"/>
+          <w:sz w:val="24"/>
+        </w:rPr>
         <w:t xml:space="preserve"> </w:t>
       </w:r>
       <w:r>
         <w:rPr>
-          <w:rFonts w:hint="eastAsia"/>
+          <w:rFonts w:hint="eastAsia" w:ascii="Times New Roman" w:hAnsi="Times New Roman" w:eastAsia="宋体"/>
+          <w:sz w:val="24"/>
         </w:rPr>
         <w:t xml:space="preserve">3.0V，UNO</w:t>
       </w:r>
       <w:r>
+        <w:rPr>
+          <w:rFonts w:ascii="Times New Roman" w:hAnsi="Times New Roman" w:eastAsia="宋体"/>
+          <w:sz w:val="24"/>
+        </w:rPr>
         <w:t xml:space="preserve"> R4 WiFi </w:t>
       </w:r>
       <w:r>
         <w:rPr>
-          <w:rFonts w:hint="eastAsia"/>
+          <w:rFonts w:hint="eastAsia" w:ascii="Times New Roman" w:hAnsi="Times New Roman" w:eastAsia="宋体"/>
+          <w:sz w:val="24"/>
         </w:rPr>
         <w:t xml:space="preserve">的</w:t>
       </w:r>
       <w:r>
+        <w:rPr>
+          <w:rFonts w:ascii="Times New Roman" w:hAnsi="Times New Roman" w:eastAsia="宋体"/>
+          <w:sz w:val="24"/>
+        </w:rPr>
         <w:t xml:space="preserve"> ADC </w:t>
       </w:r>
       <w:r>
         <w:rPr>
-          <w:rFonts w:hint="eastAsia"/>
+          <w:rFonts w:hint="eastAsia" w:ascii="Times New Roman" w:hAnsi="Times New Roman" w:eastAsia="宋体"/>
+          <w:sz w:val="24"/>
         </w:rPr>
         <w:t xml:space="preserve">量程为</w:t>
       </w:r>
       <w:r>
+        <w:rPr>
+          <w:rFonts w:ascii="Times New Roman" w:hAnsi="Times New Roman" w:eastAsia="宋体"/>
+          <w:sz w:val="24"/>
+        </w:rPr>
         <w:t xml:space="preserve"> </w:t>
       </w:r>
       <w:r>
         <w:rPr>
-          <w:rFonts w:hint="eastAsia"/>
+          <w:rFonts w:hint="eastAsia" w:ascii="Times New Roman" w:hAnsi="Times New Roman" w:eastAsia="宋体"/>
+          <w:sz w:val="24"/>
         </w:rPr>
         <w:t xml:space="preserve">0～5V（14-bit，5000mV</w:t>
       </w:r>
       <w:r>
+        <w:rPr>
+          <w:rFonts w:ascii="Times New Roman" w:hAnsi="Times New Roman" w:eastAsia="宋体"/>
+          <w:sz w:val="24"/>
+        </w:rPr>
         <w:t xml:space="preserve"> </w:t>
       </w:r>
       <w:r>
         <w:rPr>
-          <w:rFonts w:hint="eastAsia"/>
+          <w:rFonts w:hint="eastAsia" w:ascii="Times New Roman" w:hAnsi="Times New Roman" w:eastAsia="宋体"/>
+          <w:sz w:val="24"/>
         </w:rPr>
         <w:t xml:space="preserve">参考），无需电平转换，直接连接即可</w:t>
       </w:r>
@@ -4281,10 +4631,12 @@
           <w:ilvl w:val="0"/>
           <w:numId w:val="1007"/>
         </w:numPr>
-      </w:pPr>
-      <w:r>
-        <w:rPr>
-          <w:rFonts w:hint="eastAsia"/>
+        <w:spacing w:line="360" w:lineRule="auto"/>
+      </w:pPr>
+      <w:r>
+        <w:rPr>
+          <w:rFonts w:hint="eastAsia" w:ascii="Times New Roman" w:hAnsi="Times New Roman" w:eastAsia="宋体"/>
+          <w:sz w:val="24"/>
         </w:rPr>
         <w:t xml:space="preserve">红线和黑线不可接反，否则可能损坏传感器</w:t>
       </w:r>
@@ -4292,19 +4644,26 @@
     <w:p>
       <w:pPr>
         <w:pStyle w:val="BlockText"/>
-      </w:pPr>
-      <w:r>
-        <w:rPr>
-          <w:rFonts w:hint="eastAsia"/>
+        <w:spacing w:line="360" w:lineRule="auto"/>
+      </w:pPr>
+      <w:r>
+        <w:rPr>
+          <w:rFonts w:hint="eastAsia" w:ascii="Times New Roman" w:hAnsi="Times New Roman" w:eastAsia="宋体"/>
+          <w:sz w:val="24"/>
         </w:rPr>
         <w:t xml:space="preserve">引脚线序定义见</w:t>
       </w:r>
       <w:r>
+        <w:rPr>
+          <w:rFonts w:ascii="Times New Roman" w:hAnsi="Times New Roman" w:eastAsia="宋体"/>
+          <w:sz w:val="24"/>
+        </w:rPr>
         <w:t xml:space="preserve"> </w:t>
       </w:r>
       <w:r>
         <w:rPr>
-          <w:rFonts w:hint="eastAsia"/>
+          <w:rFonts w:hint="eastAsia" w:ascii="Times New Roman" w:hAnsi="Times New Roman" w:eastAsia="宋体"/>
+          <w:sz w:val="24"/>
         </w:rPr>
         <w:t xml:space="preserve">§2.2，本节为接线速查。</w:t>
       </w:r>
@@ -4332,45 +4691,63 @@
           <w:ilvl w:val="0"/>
           <w:numId w:val="1008"/>
         </w:numPr>
-      </w:pPr>
-      <w:r>
-        <w:rPr>
-          <w:rFonts w:hint="eastAsia"/>
+        <w:spacing w:line="360" w:lineRule="auto"/>
+      </w:pPr>
+      <w:r>
+        <w:rPr>
+          <w:rFonts w:hint="eastAsia" w:ascii="Times New Roman" w:hAnsi="Times New Roman" w:eastAsia="宋体"/>
           <w:b/>
           <w:bCs/>
+          <w:sz w:val="24"/>
         </w:rPr>
         <w:t xml:space="preserve">LED_BUILTIN（D13）</w:t>
       </w:r>
       <w:r>
         <w:rPr>
-          <w:rFonts w:hint="eastAsia"/>
+          <w:rFonts w:hint="eastAsia" w:ascii="Times New Roman" w:hAnsi="Times New Roman" w:eastAsia="宋体"/>
+          <w:sz w:val="24"/>
         </w:rPr>
         <w:t xml:space="preserve">：板载</w:t>
       </w:r>
       <w:r>
+        <w:rPr>
+          <w:rFonts w:ascii="Times New Roman" w:hAnsi="Times New Roman" w:eastAsia="宋体"/>
+          <w:sz w:val="24"/>
+        </w:rPr>
         <w:t xml:space="preserve"> </w:t>
       </w:r>
       <w:r>
         <w:rPr>
-          <w:rFonts w:hint="eastAsia"/>
+          <w:rFonts w:hint="eastAsia" w:ascii="Times New Roman" w:hAnsi="Times New Roman" w:eastAsia="宋体"/>
+          <w:sz w:val="24"/>
         </w:rPr>
         <w:t xml:space="preserve">LED，低电平点亮；上电常亮，作为电源</w:t>
       </w:r>
       <w:r>
+        <w:rPr>
+          <w:rFonts w:ascii="Times New Roman" w:hAnsi="Times New Roman" w:eastAsia="宋体"/>
+          <w:sz w:val="24"/>
+        </w:rPr>
         <w:t xml:space="preserve"> / </w:t>
       </w:r>
       <w:r>
         <w:rPr>
-          <w:rFonts w:hint="eastAsia"/>
+          <w:rFonts w:hint="eastAsia" w:ascii="Times New Roman" w:hAnsi="Times New Roman" w:eastAsia="宋体"/>
+          <w:sz w:val="24"/>
         </w:rPr>
         <w:t xml:space="preserve">运行指示（启动时置</w:t>
       </w:r>
       <w:r>
+        <w:rPr>
+          <w:rFonts w:ascii="Times New Roman" w:hAnsi="Times New Roman" w:eastAsia="宋体"/>
+          <w:sz w:val="24"/>
+        </w:rPr>
         <w:t xml:space="preserve"> </w:t>
       </w:r>
       <w:r>
         <w:rPr>
-          <w:rFonts w:hint="eastAsia"/>
+          <w:rFonts w:hint="eastAsia" w:ascii="Times New Roman" w:hAnsi="Times New Roman" w:eastAsia="宋体"/>
+          <w:sz w:val="24"/>
         </w:rPr>
         <w:t xml:space="preserve">LOW，运行期不再翻转）</w:t>
       </w:r>
@@ -4382,53 +4759,77 @@
           <w:ilvl w:val="0"/>
           <w:numId w:val="1008"/>
         </w:numPr>
-      </w:pPr>
-      <w:r>
-        <w:rPr>
+        <w:spacing w:line="360" w:lineRule="auto"/>
+      </w:pPr>
+      <w:r>
+        <w:rPr>
+          <w:rFonts w:ascii="Times New Roman" w:hAnsi="Times New Roman" w:eastAsia="宋体"/>
           <w:b/>
           <w:bCs/>
+          <w:sz w:val="24"/>
         </w:rPr>
         <w:t xml:space="preserve">D2 / D3 / D4</w:t>
       </w:r>
       <w:r>
         <w:rPr>
-          <w:rFonts w:hint="eastAsia"/>
+          <w:rFonts w:hint="eastAsia" w:ascii="Times New Roman" w:hAnsi="Times New Roman" w:eastAsia="宋体"/>
+          <w:sz w:val="24"/>
         </w:rPr>
         <w:t xml:space="preserve">：RGB</w:t>
       </w:r>
       <w:r>
+        <w:rPr>
+          <w:rFonts w:ascii="Times New Roman" w:hAnsi="Times New Roman" w:eastAsia="宋体"/>
+          <w:sz w:val="24"/>
+        </w:rPr>
         <w:t xml:space="preserve"> </w:t>
       </w:r>
       <w:r>
         <w:rPr>
-          <w:rFonts w:hint="eastAsia"/>
+          <w:rFonts w:hint="eastAsia" w:ascii="Times New Roman" w:hAnsi="Times New Roman" w:eastAsia="宋体"/>
+          <w:sz w:val="24"/>
         </w:rPr>
         <w:t xml:space="preserve">三色</w:t>
       </w:r>
       <w:r>
+        <w:rPr>
+          <w:rFonts w:ascii="Times New Roman" w:hAnsi="Times New Roman" w:eastAsia="宋体"/>
+          <w:sz w:val="24"/>
+        </w:rPr>
         <w:t xml:space="preserve"> LED </w:t>
       </w:r>
       <w:r>
         <w:rPr>
-          <w:rFonts w:hint="eastAsia"/>
+          <w:rFonts w:hint="eastAsia" w:ascii="Times New Roman" w:hAnsi="Times New Roman" w:eastAsia="宋体"/>
+          <w:sz w:val="24"/>
         </w:rPr>
         <w:t xml:space="preserve">通道（PIN_RGB_R</w:t>
       </w:r>
       <w:r>
+        <w:rPr>
+          <w:rFonts w:ascii="Times New Roman" w:hAnsi="Times New Roman" w:eastAsia="宋体"/>
+          <w:sz w:val="24"/>
+        </w:rPr>
         <w:t xml:space="preserve"> / PIN_RGB_G / </w:t>
       </w:r>
       <w:r>
         <w:rPr>
-          <w:rFonts w:hint="eastAsia"/>
+          <w:rFonts w:hint="eastAsia" w:ascii="Times New Roman" w:hAnsi="Times New Roman" w:eastAsia="宋体"/>
+          <w:sz w:val="24"/>
         </w:rPr>
         <w:t xml:space="preserve">PIN_RGB_B），用于疲劳状态指示；引脚与颜色映射见</w:t>
       </w:r>
       <w:r>
+        <w:rPr>
+          <w:rFonts w:ascii="Times New Roman" w:hAnsi="Times New Roman" w:eastAsia="宋体"/>
+          <w:sz w:val="24"/>
+        </w:rPr>
         <w:t xml:space="preserve"> §3.5 </w:t>
       </w:r>
       <w:r>
         <w:rPr>
-          <w:rFonts w:hint="eastAsia"/>
+          <w:rFonts w:hint="eastAsia" w:ascii="Times New Roman" w:hAnsi="Times New Roman" w:eastAsia="宋体"/>
+          <w:sz w:val="24"/>
         </w:rPr>
         <w:t xml:space="preserve">引脚分配总表。</w:t>
       </w:r>
@@ -4452,57 +4853,84 @@
     <w:p>
       <w:pPr>
         <w:pStyle w:val="FirstParagraph"/>
-      </w:pPr>
-      <w:r>
+        <w:spacing w:line="360" w:lineRule="auto"/>
+      </w:pPr>
+      <w:r>
+        <w:rPr>
+          <w:rFonts w:ascii="Times New Roman" w:hAnsi="Times New Roman" w:eastAsia="宋体"/>
+          <w:sz w:val="24"/>
+        </w:rPr>
         <w:t xml:space="preserve">RGB </w:t>
       </w:r>
       <w:r>
         <w:rPr>
-          <w:rFonts w:hint="eastAsia"/>
+          <w:rFonts w:hint="eastAsia" w:ascii="Times New Roman" w:hAnsi="Times New Roman" w:eastAsia="宋体"/>
+          <w:sz w:val="24"/>
         </w:rPr>
         <w:t xml:space="preserve">三色</w:t>
       </w:r>
       <w:r>
+        <w:rPr>
+          <w:rFonts w:ascii="Times New Roman" w:hAnsi="Times New Roman" w:eastAsia="宋体"/>
+          <w:sz w:val="24"/>
+        </w:rPr>
         <w:t xml:space="preserve"> LED </w:t>
       </w:r>
       <w:r>
         <w:rPr>
-          <w:rFonts w:hint="eastAsia"/>
+          <w:rFonts w:hint="eastAsia" w:ascii="Times New Roman" w:hAnsi="Times New Roman" w:eastAsia="宋体"/>
+          <w:sz w:val="24"/>
         </w:rPr>
         <w:t xml:space="preserve">在</w:t>
       </w:r>
       <w:r>
+        <w:rPr>
+          <w:rFonts w:ascii="Times New Roman" w:hAnsi="Times New Roman" w:eastAsia="宋体"/>
+          <w:sz w:val="24"/>
+        </w:rPr>
         <w:t xml:space="preserve"> </w:t>
       </w:r>
       <w:r>
         <w:rPr>
-          <w:rFonts w:hint="eastAsia"/>
+          <w:rFonts w:hint="eastAsia" w:ascii="Times New Roman" w:hAnsi="Times New Roman" w:eastAsia="宋体"/>
           <w:b/>
           <w:bCs/>
+          <w:sz w:val="24"/>
         </w:rPr>
         <w:t xml:space="preserve">RUNNING（实时监测）状态</w:t>
       </w:r>
       <w:r>
         <w:rPr>
-          <w:rFonts w:hint="eastAsia"/>
+          <w:rFonts w:hint="eastAsia" w:ascii="Times New Roman" w:hAnsi="Times New Roman" w:eastAsia="宋体"/>
+          <w:sz w:val="24"/>
         </w:rPr>
         <w:t xml:space="preserve">按疲劳度映射颜色；非</w:t>
       </w:r>
       <w:r>
+        <w:rPr>
+          <w:rFonts w:ascii="Times New Roman" w:hAnsi="Times New Roman" w:eastAsia="宋体"/>
+          <w:sz w:val="24"/>
+        </w:rPr>
         <w:t xml:space="preserve"> RUNNING </w:t>
       </w:r>
       <w:r>
         <w:rPr>
-          <w:rFonts w:hint="eastAsia"/>
+          <w:rFonts w:hint="eastAsia" w:ascii="Times New Roman" w:hAnsi="Times New Roman" w:eastAsia="宋体"/>
+          <w:sz w:val="24"/>
         </w:rPr>
         <w:t xml:space="preserve">态（开机初始化</w:t>
       </w:r>
       <w:r>
+        <w:rPr>
+          <w:rFonts w:ascii="Times New Roman" w:hAnsi="Times New Roman" w:eastAsia="宋体"/>
+          <w:sz w:val="24"/>
+        </w:rPr>
         <w:t xml:space="preserve"> / </w:t>
       </w:r>
       <w:r>
         <w:rPr>
-          <w:rFonts w:hint="eastAsia"/>
+          <w:rFonts w:hint="eastAsia" w:ascii="Times New Roman" w:hAnsi="Times New Roman" w:eastAsia="宋体"/>
+          <w:sz w:val="24"/>
         </w:rPr>
         <w:t xml:space="preserve">错误态）三灯全灭。</w:t>
       </w:r>
@@ -4510,15 +4938,15 @@
     <w:tbl>
       <w:tblPr>
         <w:tblStyle w:val="Table"/>
-        <w:tblW w:type="dxa" w:w="9070"/>
+        <w:tblW w:type="dxa" w:w="8305"/>
         <w:jc w:val="center"/>
         <w:tblLayout w:type="fixed"/>
         <w:tblLook w:firstRow="1" w:lastRow="0" w:firstColumn="0" w:lastColumn="0" w:noHBand="0" w:noVBand="0" w:val="0020"/>
       </w:tblPr>
       <w:tblGrid>
-        <w:gridCol w:w="3023"/>
-        <w:gridCol w:w="3023"/>
-        <w:gridCol w:w="3024"/>
+        <w:gridCol w:w="2768"/>
+        <w:gridCol w:w="2768"/>
+        <w:gridCol w:w="2769"/>
       </w:tblGrid>
       <w:tr>
         <w:trPr>
@@ -4527,7 +4955,7 @@
         <w:tc>
           <w:tcPr>
             <w:shd w:val="clear" w:color="auto" w:fill="2E5A9C"/>
-            <w:tcW w:type="dxa" w:w="3023"/>
+            <w:tcW w:type="dxa" w:w="2768"/>
             <w:tcBorders>
               <w:top w:val="single" w:sz="8" w:color="2E5A9C"/>
               <w:left w:val="single" w:sz="8" w:color="2E5A9C"/>
@@ -4564,7 +4992,7 @@
         <w:tc>
           <w:tcPr>
             <w:shd w:val="clear" w:color="auto" w:fill="2E5A9C"/>
-            <w:tcW w:type="dxa" w:w="3023"/>
+            <w:tcW w:type="dxa" w:w="2768"/>
             <w:tcBorders>
               <w:top w:val="single" w:sz="8" w:color="2E5A9C"/>
               <w:left w:val="single" w:sz="8" w:color="2E5A9C"/>
@@ -4592,7 +5020,7 @@
         <w:tc>
           <w:tcPr>
             <w:shd w:val="clear" w:color="auto" w:fill="2E5A9C"/>
-            <w:tcW w:type="dxa" w:w="3024"/>
+            <w:tcW w:type="dxa" w:w="2769"/>
             <w:tcBorders>
               <w:top w:val="single" w:sz="8" w:color="2E5A9C"/>
               <w:left w:val="single" w:sz="8" w:color="2E5A9C"/>
@@ -4621,7 +5049,7 @@
       <w:tr>
         <w:tc>
           <w:tcPr>
-            <w:tcW w:type="dxa" w:w="3023"/>
+            <w:tcW w:type="dxa" w:w="2768"/>
             <w:tcBorders>
               <w:top w:val="single" w:sz="4" w:color="E5E7EB"/>
               <w:left w:val="single" w:sz="4" w:color="E5E7EB"/>
@@ -4646,7 +5074,7 @@
         </w:tc>
         <w:tc>
           <w:tcPr>
-            <w:tcW w:type="dxa" w:w="3023"/>
+            <w:tcW w:type="dxa" w:w="2768"/>
             <w:tcBorders>
               <w:top w:val="single" w:sz="4" w:color="E5E7EB"/>
               <w:left w:val="single" w:sz="4" w:color="E5E7EB"/>
@@ -4685,7 +5113,7 @@
         </w:tc>
         <w:tc>
           <w:tcPr>
-            <w:tcW w:type="dxa" w:w="3024"/>
+            <w:tcW w:type="dxa" w:w="2769"/>
             <w:tcBorders>
               <w:top w:val="single" w:sz="4" w:color="E5E7EB"/>
               <w:left w:val="single" w:sz="4" w:color="E5E7EB"/>
@@ -4712,7 +5140,7 @@
       <w:tr>
         <w:tc>
           <w:tcPr>
-            <w:tcW w:type="dxa" w:w="3023"/>
+            <w:tcW w:type="dxa" w:w="2768"/>
             <w:tcBorders>
               <w:top w:val="single" w:sz="4" w:color="E5E7EB"/>
               <w:left w:val="single" w:sz="4" w:color="E5E7EB"/>
@@ -4737,7 +5165,7 @@
         </w:tc>
         <w:tc>
           <w:tcPr>
-            <w:tcW w:type="dxa" w:w="3023"/>
+            <w:tcW w:type="dxa" w:w="2768"/>
             <w:tcBorders>
               <w:top w:val="single" w:sz="4" w:color="E5E7EB"/>
               <w:left w:val="single" w:sz="4" w:color="E5E7EB"/>
@@ -4776,7 +5204,7 @@
         </w:tc>
         <w:tc>
           <w:tcPr>
-            <w:tcW w:type="dxa" w:w="3024"/>
+            <w:tcW w:type="dxa" w:w="2769"/>
             <w:tcBorders>
               <w:top w:val="single" w:sz="4" w:color="E5E7EB"/>
               <w:left w:val="single" w:sz="4" w:color="E5E7EB"/>
@@ -4803,7 +5231,7 @@
       <w:tr>
         <w:tc>
           <w:tcPr>
-            <w:tcW w:type="dxa" w:w="3023"/>
+            <w:tcW w:type="dxa" w:w="2768"/>
             <w:tcBorders>
               <w:top w:val="single" w:sz="4" w:color="E5E7EB"/>
               <w:left w:val="single" w:sz="4" w:color="E5E7EB"/>
@@ -4828,7 +5256,7 @@
         </w:tc>
         <w:tc>
           <w:tcPr>
-            <w:tcW w:type="dxa" w:w="3023"/>
+            <w:tcW w:type="dxa" w:w="2768"/>
             <w:tcBorders>
               <w:top w:val="single" w:sz="4" w:color="E5E7EB"/>
               <w:left w:val="single" w:sz="4" w:color="E5E7EB"/>
@@ -4867,7 +5295,7 @@
         </w:tc>
         <w:tc>
           <w:tcPr>
-            <w:tcW w:type="dxa" w:w="3024"/>
+            <w:tcW w:type="dxa" w:w="2769"/>
             <w:tcBorders>
               <w:top w:val="single" w:sz="4" w:color="E5E7EB"/>
               <w:left w:val="single" w:sz="4" w:color="E5E7EB"/>
@@ -4894,7 +5322,7 @@
       <w:tr>
         <w:tc>
           <w:tcPr>
-            <w:tcW w:type="dxa" w:w="3023"/>
+            <w:tcW w:type="dxa" w:w="2768"/>
             <w:tcBorders>
               <w:top w:val="single" w:sz="4" w:color="E5E7EB"/>
               <w:left w:val="single" w:sz="4" w:color="E5E7EB"/>
@@ -4947,7 +5375,7 @@
         </w:tc>
         <w:tc>
           <w:tcPr>
-            <w:tcW w:type="dxa" w:w="3023"/>
+            <w:tcW w:type="dxa" w:w="2768"/>
             <w:tcBorders>
               <w:top w:val="single" w:sz="4" w:color="E5E7EB"/>
               <w:left w:val="single" w:sz="4" w:color="E5E7EB"/>
@@ -4972,7 +5400,7 @@
         </w:tc>
         <w:tc>
           <w:tcPr>
-            <w:tcW w:type="dxa" w:w="3024"/>
+            <w:tcW w:type="dxa" w:w="2769"/>
             <w:tcBorders>
               <w:top w:val="single" w:sz="4" w:color="E5E7EB"/>
               <w:left w:val="single" w:sz="4" w:color="E5E7EB"/>
@@ -5000,23 +5428,34 @@
     <w:p>
       <w:pPr>
         <w:pStyle w:val="BlockText"/>
-      </w:pPr>
-      <w:r>
-        <w:rPr>
-          <w:rFonts w:hint="eastAsia"/>
+        <w:spacing w:line="360" w:lineRule="auto"/>
+      </w:pPr>
+      <w:r>
+        <w:rPr>
+          <w:rFonts w:hint="eastAsia" w:ascii="Times New Roman" w:hAnsi="Times New Roman" w:eastAsia="宋体"/>
+          <w:sz w:val="24"/>
         </w:rPr>
         <w:t xml:space="preserve">疲劳度</w:t>
       </w:r>
       <w:r>
+        <w:rPr>
+          <w:rFonts w:ascii="Times New Roman" w:hAnsi="Times New Roman" w:eastAsia="宋体"/>
+          <w:sz w:val="24"/>
+        </w:rPr>
         <w:t xml:space="preserve"> F </w:t>
       </w:r>
       <w:r>
         <w:rPr>
-          <w:rFonts w:hint="eastAsia"/>
+          <w:rFonts w:hint="eastAsia" w:ascii="Times New Roman" w:hAnsi="Times New Roman" w:eastAsia="宋体"/>
+          <w:sz w:val="24"/>
         </w:rPr>
         <w:t xml:space="preserve">的计算公式与归一化锚点，见</w:t>
       </w:r>
       <w:r>
+        <w:rPr>
+          <w:rFonts w:ascii="Times New Roman" w:hAnsi="Times New Roman" w:eastAsia="宋体"/>
+          <w:sz w:val="24"/>
+        </w:rPr>
         <w:t xml:space="preserve"> </w:t>
       </w:r>
       <w:hyperlink r:id="rId10">
@@ -5029,14 +5468,23 @@
         </w:r>
       </w:hyperlink>
       <w:r>
+        <w:rPr>
+          <w:rFonts w:ascii="Times New Roman" w:hAnsi="Times New Roman" w:eastAsia="宋体"/>
+          <w:sz w:val="24"/>
+        </w:rPr>
         <w:t xml:space="preserve"> </w:t>
       </w:r>
       <w:r>
+        <w:rPr>
+          <w:rFonts w:ascii="Times New Roman" w:hAnsi="Times New Roman" w:eastAsia="宋体"/>
+          <w:sz w:val="24"/>
+        </w:rPr>
         <w:t xml:space="preserve">§3.4 </w:t>
       </w:r>
       <w:r>
         <w:rPr>
-          <w:rFonts w:hint="eastAsia"/>
+          <w:rFonts w:hint="eastAsia" w:ascii="Times New Roman" w:hAnsi="Times New Roman" w:eastAsia="宋体"/>
+          <w:sz w:val="24"/>
         </w:rPr>
         <w:t xml:space="preserve">激活度与疲劳度计算。</w:t>
       </w:r>
@@ -5060,15 +5508,15 @@
     <w:tbl>
       <w:tblPr>
         <w:tblStyle w:val="Table"/>
-        <w:tblW w:type="dxa" w:w="9070"/>
+        <w:tblW w:type="dxa" w:w="8305"/>
         <w:jc w:val="center"/>
         <w:tblLayout w:type="fixed"/>
         <w:tblLook w:firstRow="1" w:lastRow="0" w:firstColumn="0" w:lastColumn="0" w:noHBand="0" w:noVBand="0" w:val="0020"/>
       </w:tblPr>
       <w:tblGrid>
-        <w:gridCol w:w="3023"/>
-        <w:gridCol w:w="3023"/>
-        <w:gridCol w:w="3024"/>
+        <w:gridCol w:w="2768"/>
+        <w:gridCol w:w="2768"/>
+        <w:gridCol w:w="2769"/>
       </w:tblGrid>
       <w:tr>
         <w:trPr>
@@ -5077,7 +5525,7 @@
         <w:tc>
           <w:tcPr>
             <w:shd w:val="clear" w:color="auto" w:fill="2E5A9C"/>
-            <w:tcW w:type="dxa" w:w="3023"/>
+            <w:tcW w:type="dxa" w:w="2768"/>
             <w:tcBorders>
               <w:top w:val="single" w:sz="8" w:color="2E5A9C"/>
               <w:left w:val="single" w:sz="8" w:color="2E5A9C"/>
@@ -5105,7 +5553,7 @@
         <w:tc>
           <w:tcPr>
             <w:shd w:val="clear" w:color="auto" w:fill="2E5A9C"/>
-            <w:tcW w:type="dxa" w:w="3023"/>
+            <w:tcW w:type="dxa" w:w="2768"/>
             <w:tcBorders>
               <w:top w:val="single" w:sz="8" w:color="2E5A9C"/>
               <w:left w:val="single" w:sz="8" w:color="2E5A9C"/>
@@ -5151,7 +5599,7 @@
         <w:tc>
           <w:tcPr>
             <w:shd w:val="clear" w:color="auto" w:fill="2E5A9C"/>
-            <w:tcW w:type="dxa" w:w="3024"/>
+            <w:tcW w:type="dxa" w:w="2769"/>
             <w:tcBorders>
               <w:top w:val="single" w:sz="8" w:color="2E5A9C"/>
               <w:left w:val="single" w:sz="8" w:color="2E5A9C"/>
@@ -5180,7 +5628,7 @@
       <w:tr>
         <w:tc>
           <w:tcPr>
-            <w:tcW w:type="dxa" w:w="3023"/>
+            <w:tcW w:type="dxa" w:w="2768"/>
             <w:tcBorders>
               <w:top w:val="single" w:sz="4" w:color="E5E7EB"/>
               <w:left w:val="single" w:sz="4" w:color="E5E7EB"/>
@@ -5205,7 +5653,7 @@
         </w:tc>
         <w:tc>
           <w:tcPr>
-            <w:tcW w:type="dxa" w:w="3023"/>
+            <w:tcW w:type="dxa" w:w="2768"/>
             <w:tcBorders>
               <w:top w:val="single" w:sz="4" w:color="E5E7EB"/>
               <w:left w:val="single" w:sz="4" w:color="E5E7EB"/>
@@ -5237,7 +5685,7 @@
         </w:tc>
         <w:tc>
           <w:tcPr>
-            <w:tcW w:type="dxa" w:w="3024"/>
+            <w:tcW w:type="dxa" w:w="2769"/>
             <w:tcBorders>
               <w:top w:val="single" w:sz="4" w:color="E5E7EB"/>
               <w:left w:val="single" w:sz="4" w:color="E5E7EB"/>
@@ -5285,7 +5733,7 @@
       <w:tr>
         <w:tc>
           <w:tcPr>
-            <w:tcW w:type="dxa" w:w="3023"/>
+            <w:tcW w:type="dxa" w:w="2768"/>
             <w:tcBorders>
               <w:top w:val="single" w:sz="4" w:color="E5E7EB"/>
               <w:left w:val="single" w:sz="4" w:color="E5E7EB"/>
@@ -5310,7 +5758,7 @@
         </w:tc>
         <w:tc>
           <w:tcPr>
-            <w:tcW w:type="dxa" w:w="3023"/>
+            <w:tcW w:type="dxa" w:w="2768"/>
             <w:tcBorders>
               <w:top w:val="single" w:sz="4" w:color="E5E7EB"/>
               <w:left w:val="single" w:sz="4" w:color="E5E7EB"/>
@@ -5335,7 +5783,7 @@
         </w:tc>
         <w:tc>
           <w:tcPr>
-            <w:tcW w:type="dxa" w:w="3024"/>
+            <w:tcW w:type="dxa" w:w="2769"/>
             <w:tcBorders>
               <w:top w:val="single" w:sz="4" w:color="E5E7EB"/>
               <w:left w:val="single" w:sz="4" w:color="E5E7EB"/>
@@ -5369,7 +5817,7 @@
       <w:tr>
         <w:tc>
           <w:tcPr>
-            <w:tcW w:type="dxa" w:w="3023"/>
+            <w:tcW w:type="dxa" w:w="2768"/>
             <w:tcBorders>
               <w:top w:val="single" w:sz="4" w:color="E5E7EB"/>
               <w:left w:val="single" w:sz="4" w:color="E5E7EB"/>
@@ -5394,7 +5842,7 @@
         </w:tc>
         <w:tc>
           <w:tcPr>
-            <w:tcW w:type="dxa" w:w="3023"/>
+            <w:tcW w:type="dxa" w:w="2768"/>
             <w:tcBorders>
               <w:top w:val="single" w:sz="4" w:color="E5E7EB"/>
               <w:left w:val="single" w:sz="4" w:color="E5E7EB"/>
@@ -5419,7 +5867,7 @@
         </w:tc>
         <w:tc>
           <w:tcPr>
-            <w:tcW w:type="dxa" w:w="3024"/>
+            <w:tcW w:type="dxa" w:w="2769"/>
             <w:tcBorders>
               <w:top w:val="single" w:sz="4" w:color="E5E7EB"/>
               <w:left w:val="single" w:sz="4" w:color="E5E7EB"/>
@@ -5453,7 +5901,7 @@
       <w:tr>
         <w:tc>
           <w:tcPr>
-            <w:tcW w:type="dxa" w:w="3023"/>
+            <w:tcW w:type="dxa" w:w="2768"/>
             <w:tcBorders>
               <w:top w:val="single" w:sz="4" w:color="E5E7EB"/>
               <w:left w:val="single" w:sz="4" w:color="E5E7EB"/>
@@ -5478,7 +5926,7 @@
         </w:tc>
         <w:tc>
           <w:tcPr>
-            <w:tcW w:type="dxa" w:w="3023"/>
+            <w:tcW w:type="dxa" w:w="2768"/>
             <w:tcBorders>
               <w:top w:val="single" w:sz="4" w:color="E5E7EB"/>
               <w:left w:val="single" w:sz="4" w:color="E5E7EB"/>
@@ -5503,7 +5951,7 @@
         </w:tc>
         <w:tc>
           <w:tcPr>
-            <w:tcW w:type="dxa" w:w="3024"/>
+            <w:tcW w:type="dxa" w:w="2769"/>
             <w:tcBorders>
               <w:top w:val="single" w:sz="4" w:color="E5E7EB"/>
               <w:left w:val="single" w:sz="4" w:color="E5E7EB"/>
@@ -5537,7 +5985,7 @@
       <w:tr>
         <w:tc>
           <w:tcPr>
-            <w:tcW w:type="dxa" w:w="3023"/>
+            <w:tcW w:type="dxa" w:w="2768"/>
             <w:tcBorders>
               <w:top w:val="single" w:sz="4" w:color="E5E7EB"/>
               <w:left w:val="single" w:sz="4" w:color="E5E7EB"/>
@@ -5562,7 +6010,7 @@
         </w:tc>
         <w:tc>
           <w:tcPr>
-            <w:tcW w:type="dxa" w:w="3023"/>
+            <w:tcW w:type="dxa" w:w="2768"/>
             <w:tcBorders>
               <w:top w:val="single" w:sz="4" w:color="E5E7EB"/>
               <w:left w:val="single" w:sz="4" w:color="E5E7EB"/>
@@ -5587,7 +6035,7 @@
         </w:tc>
         <w:tc>
           <w:tcPr>
-            <w:tcW w:type="dxa" w:w="3024"/>
+            <w:tcW w:type="dxa" w:w="2769"/>
             <w:tcBorders>
               <w:top w:val="single" w:sz="4" w:color="E5E7EB"/>
               <w:left w:val="single" w:sz="4" w:color="E5E7EB"/>
@@ -5628,7 +6076,7 @@
       <w:tr>
         <w:tc>
           <w:tcPr>
-            <w:tcW w:type="dxa" w:w="3023"/>
+            <w:tcW w:type="dxa" w:w="2768"/>
             <w:tcBorders>
               <w:top w:val="single" w:sz="4" w:color="E5E7EB"/>
               <w:left w:val="single" w:sz="4" w:color="E5E7EB"/>
@@ -5653,7 +6101,7 @@
         </w:tc>
         <w:tc>
           <w:tcPr>
-            <w:tcW w:type="dxa" w:w="3023"/>
+            <w:tcW w:type="dxa" w:w="2768"/>
             <w:tcBorders>
               <w:top w:val="single" w:sz="4" w:color="E5E7EB"/>
               <w:left w:val="single" w:sz="4" w:color="E5E7EB"/>
@@ -5678,7 +6126,7 @@
         </w:tc>
         <w:tc>
           <w:tcPr>
-            <w:tcW w:type="dxa" w:w="3024"/>
+            <w:tcW w:type="dxa" w:w="2769"/>
             <w:tcBorders>
               <w:top w:val="single" w:sz="4" w:color="E5E7EB"/>
               <w:left w:val="single" w:sz="4" w:color="E5E7EB"/>
@@ -5810,54 +6258,77 @@
           <w:ilvl w:val="0"/>
           <w:numId w:val="1009"/>
         </w:numPr>
-      </w:pPr>
-      <w:r>
-        <w:rPr>
-          <w:rFonts w:hint="eastAsia"/>
+        <w:spacing w:line="360" w:lineRule="auto"/>
+      </w:pPr>
+      <w:r>
+        <w:rPr>
+          <w:rFonts w:hint="eastAsia" w:ascii="Times New Roman" w:hAnsi="Times New Roman" w:eastAsia="宋体"/>
           <w:b/>
           <w:bCs/>
+          <w:sz w:val="24"/>
         </w:rPr>
         <w:t xml:space="preserve">佩戴位置</w:t>
       </w:r>
       <w:r>
         <w:rPr>
-          <w:rFonts w:hint="eastAsia"/>
+          <w:rFonts w:hint="eastAsia" w:ascii="Times New Roman" w:hAnsi="Times New Roman" w:eastAsia="宋体"/>
+          <w:sz w:val="24"/>
         </w:rPr>
         <w:t xml:space="preserve">：上臂前侧肱二头肌肌腹中部（约在肩峰与肘窝连线中点处），导联板沿肌纤维方向纵向贴附；DRY+、DRY-</w:t>
       </w:r>
       <w:r>
+        <w:rPr>
+          <w:rFonts w:ascii="Times New Roman" w:hAnsi="Times New Roman" w:eastAsia="宋体"/>
+          <w:sz w:val="24"/>
+        </w:rPr>
         <w:t xml:space="preserve"> </w:t>
       </w:r>
       <w:r>
         <w:rPr>
-          <w:rFonts w:hint="eastAsia"/>
+          <w:rFonts w:hint="eastAsia" w:ascii="Times New Roman" w:hAnsi="Times New Roman" w:eastAsia="宋体"/>
+          <w:sz w:val="24"/>
         </w:rPr>
         <w:t xml:space="preserve">为差分信号电极，上下位置可互换，参考电极</w:t>
       </w:r>
       <w:r>
+        <w:rPr>
+          <w:rFonts w:ascii="Times New Roman" w:hAnsi="Times New Roman" w:eastAsia="宋体"/>
+          <w:sz w:val="24"/>
+        </w:rPr>
         <w:t xml:space="preserve"> GND </w:t>
       </w:r>
       <w:r>
         <w:rPr>
-          <w:rFonts w:hint="eastAsia"/>
+          <w:rFonts w:hint="eastAsia" w:ascii="Times New Roman" w:hAnsi="Times New Roman" w:eastAsia="宋体"/>
+          <w:sz w:val="24"/>
         </w:rPr>
         <w:t xml:space="preserve">固定位于</w:t>
       </w:r>
       <w:r>
+        <w:rPr>
+          <w:rFonts w:ascii="Times New Roman" w:hAnsi="Times New Roman" w:eastAsia="宋体"/>
+          <w:sz w:val="24"/>
+        </w:rPr>
         <w:t xml:space="preserve"> DRY+ </w:t>
       </w:r>
       <w:r>
         <w:rPr>
-          <w:rFonts w:hint="eastAsia"/>
+          <w:rFonts w:hint="eastAsia" w:ascii="Times New Roman" w:hAnsi="Times New Roman" w:eastAsia="宋体"/>
+          <w:sz w:val="24"/>
         </w:rPr>
         <w:t xml:space="preserve">与</w:t>
       </w:r>
       <w:r>
+        <w:rPr>
+          <w:rFonts w:ascii="Times New Roman" w:hAnsi="Times New Roman" w:eastAsia="宋体"/>
+          <w:sz w:val="24"/>
+        </w:rPr>
         <w:t xml:space="preserve"> DRY- </w:t>
       </w:r>
       <w:r>
         <w:rPr>
-          <w:rFonts w:hint="eastAsia"/>
+          <w:rFonts w:hint="eastAsia" w:ascii="Times New Roman" w:hAnsi="Times New Roman" w:eastAsia="宋体"/>
+          <w:sz w:val="24"/>
         </w:rPr>
         <w:t xml:space="preserve">正中间，如图所示</w:t>
       </w:r>
@@ -5869,10 +6340,12 @@
           <w:ilvl w:val="0"/>
           <w:numId w:val="1009"/>
         </w:numPr>
-      </w:pPr>
-      <w:r>
-        <w:rPr>
-          <w:rFonts w:hint="eastAsia"/>
+        <w:spacing w:line="360" w:lineRule="auto"/>
+      </w:pPr>
+      <w:r>
+        <w:rPr>
+          <w:rFonts w:hint="eastAsia" w:ascii="Times New Roman" w:hAnsi="Times New Roman" w:eastAsia="宋体"/>
+          <w:sz w:val="24"/>
         </w:rPr>
         <w:t xml:space="preserve">电极应沿肌纤维方向贴附（通常与肌纤维平行）</w:t>
       </w:r>
@@ -5884,10 +6357,12 @@
           <w:ilvl w:val="0"/>
           <w:numId w:val="1009"/>
         </w:numPr>
-      </w:pPr>
-      <w:r>
-        <w:rPr>
-          <w:rFonts w:hint="eastAsia"/>
+        <w:spacing w:line="360" w:lineRule="auto"/>
+      </w:pPr>
+      <w:r>
+        <w:rPr>
+          <w:rFonts w:hint="eastAsia" w:ascii="Times New Roman" w:hAnsi="Times New Roman" w:eastAsia="宋体"/>
+          <w:sz w:val="24"/>
         </w:rPr>
         <w:t xml:space="preserve">皮肤干燥时可用酒精擦拭，提高信号质量</w:t>
       </w:r>
@@ -5911,15 +6386,15 @@
     <w:tbl>
       <w:tblPr>
         <w:tblStyle w:val="Table"/>
-        <w:tblW w:type="dxa" w:w="9070"/>
+        <w:tblW w:type="dxa" w:w="8305"/>
         <w:jc w:val="center"/>
         <w:tblLayout w:type="fixed"/>
         <w:tblLook w:firstRow="1" w:lastRow="0" w:firstColumn="0" w:lastColumn="0" w:noHBand="0" w:noVBand="0" w:val="0020"/>
       </w:tblPr>
       <w:tblGrid>
-        <w:gridCol w:w="3023"/>
-        <w:gridCol w:w="3023"/>
-        <w:gridCol w:w="3024"/>
+        <w:gridCol w:w="2768"/>
+        <w:gridCol w:w="2768"/>
+        <w:gridCol w:w="2769"/>
       </w:tblGrid>
       <w:tr>
         <w:trPr>
@@ -5928,7 +6403,7 @@
         <w:tc>
           <w:tcPr>
             <w:shd w:val="clear" w:color="auto" w:fill="2E5A9C"/>
-            <w:tcW w:type="dxa" w:w="3023"/>
+            <w:tcW w:type="dxa" w:w="2768"/>
             <w:tcBorders>
               <w:top w:val="single" w:sz="8" w:color="2E5A9C"/>
               <w:left w:val="single" w:sz="8" w:color="2E5A9C"/>
@@ -5956,7 +6431,7 @@
         <w:tc>
           <w:tcPr>
             <w:shd w:val="clear" w:color="auto" w:fill="2E5A9C"/>
-            <w:tcW w:type="dxa" w:w="3023"/>
+            <w:tcW w:type="dxa" w:w="2768"/>
             <w:tcBorders>
               <w:top w:val="single" w:sz="8" w:color="2E5A9C"/>
               <w:left w:val="single" w:sz="8" w:color="2E5A9C"/>
@@ -5984,7 +6459,7 @@
         <w:tc>
           <w:tcPr>
             <w:shd w:val="clear" w:color="auto" w:fill="2E5A9C"/>
-            <w:tcW w:type="dxa" w:w="3024"/>
+            <w:tcW w:type="dxa" w:w="2769"/>
             <w:tcBorders>
               <w:top w:val="single" w:sz="8" w:color="2E5A9C"/>
               <w:left w:val="single" w:sz="8" w:color="2E5A9C"/>
@@ -6013,7 +6488,7 @@
       <w:tr>
         <w:tc>
           <w:tcPr>
-            <w:tcW w:type="dxa" w:w="3023"/>
+            <w:tcW w:type="dxa" w:w="2768"/>
             <w:tcBorders>
               <w:top w:val="single" w:sz="4" w:color="E5E7EB"/>
               <w:left w:val="single" w:sz="4" w:color="E5E7EB"/>
@@ -6059,7 +6534,7 @@
         </w:tc>
         <w:tc>
           <w:tcPr>
-            <w:tcW w:type="dxa" w:w="3023"/>
+            <w:tcW w:type="dxa" w:w="2768"/>
             <w:tcBorders>
               <w:top w:val="single" w:sz="4" w:color="E5E7EB"/>
               <w:left w:val="single" w:sz="4" w:color="E5E7EB"/>
@@ -6084,7 +6559,7 @@
         </w:tc>
         <w:tc>
           <w:tcPr>
-            <w:tcW w:type="dxa" w:w="3024"/>
+            <w:tcW w:type="dxa" w:w="2769"/>
             <w:tcBorders>
               <w:top w:val="single" w:sz="4" w:color="E5E7EB"/>
               <w:left w:val="single" w:sz="4" w:color="E5E7EB"/>
@@ -6111,7 +6586,7 @@
       <w:tr>
         <w:tc>
           <w:tcPr>
-            <w:tcW w:type="dxa" w:w="3023"/>
+            <w:tcW w:type="dxa" w:w="2768"/>
             <w:tcBorders>
               <w:top w:val="single" w:sz="4" w:color="E5E7EB"/>
               <w:left w:val="single" w:sz="4" w:color="E5E7EB"/>
@@ -6171,7 +6646,7 @@
         </w:tc>
         <w:tc>
           <w:tcPr>
-            <w:tcW w:type="dxa" w:w="3023"/>
+            <w:tcW w:type="dxa" w:w="2768"/>
             <w:tcBorders>
               <w:top w:val="single" w:sz="4" w:color="E5E7EB"/>
               <w:left w:val="single" w:sz="4" w:color="E5E7EB"/>
@@ -6196,7 +6671,7 @@
         </w:tc>
         <w:tc>
           <w:tcPr>
-            <w:tcW w:type="dxa" w:w="3024"/>
+            <w:tcW w:type="dxa" w:w="2769"/>
             <w:tcBorders>
               <w:top w:val="single" w:sz="4" w:color="E5E7EB"/>
               <w:left w:val="single" w:sz="4" w:color="E5E7EB"/>
@@ -6223,7 +6698,7 @@
       <w:tr>
         <w:tc>
           <w:tcPr>
-            <w:tcW w:type="dxa" w:w="3023"/>
+            <w:tcW w:type="dxa" w:w="2768"/>
             <w:tcBorders>
               <w:top w:val="single" w:sz="4" w:color="E5E7EB"/>
               <w:left w:val="single" w:sz="4" w:color="E5E7EB"/>
@@ -6248,7 +6723,7 @@
         </w:tc>
         <w:tc>
           <w:tcPr>
-            <w:tcW w:type="dxa" w:w="3023"/>
+            <w:tcW w:type="dxa" w:w="2768"/>
             <w:tcBorders>
               <w:top w:val="single" w:sz="4" w:color="E5E7EB"/>
               <w:left w:val="single" w:sz="4" w:color="E5E7EB"/>
@@ -6287,7 +6762,7 @@
         </w:tc>
         <w:tc>
           <w:tcPr>
-            <w:tcW w:type="dxa" w:w="3024"/>
+            <w:tcW w:type="dxa" w:w="2769"/>
             <w:tcBorders>
               <w:top w:val="single" w:sz="4" w:color="E5E7EB"/>
               <w:left w:val="single" w:sz="4" w:color="E5E7EB"/>
@@ -6314,7 +6789,7 @@
       <w:tr>
         <w:tc>
           <w:tcPr>
-            <w:tcW w:type="dxa" w:w="3023"/>
+            <w:tcW w:type="dxa" w:w="2768"/>
             <w:tcBorders>
               <w:top w:val="single" w:sz="4" w:color="E5E7EB"/>
               <w:left w:val="single" w:sz="4" w:color="E5E7EB"/>
@@ -6346,7 +6821,7 @@
         </w:tc>
         <w:tc>
           <w:tcPr>
-            <w:tcW w:type="dxa" w:w="3023"/>
+            <w:tcW w:type="dxa" w:w="2768"/>
             <w:tcBorders>
               <w:top w:val="single" w:sz="4" w:color="E5E7EB"/>
               <w:left w:val="single" w:sz="4" w:color="E5E7EB"/>
@@ -6371,7 +6846,7 @@
         </w:tc>
         <w:tc>
           <w:tcPr>
-            <w:tcW w:type="dxa" w:w="3024"/>
+            <w:tcW w:type="dxa" w:w="2769"/>
             <w:tcBorders>
               <w:top w:val="single" w:sz="4" w:color="E5E7EB"/>
               <w:left w:val="single" w:sz="4" w:color="E5E7EB"/>
@@ -6419,46 +6894,68 @@
           <w:ilvl w:val="0"/>
           <w:numId w:val="1010"/>
         </w:numPr>
-      </w:pPr>
-      <w:r>
-        <w:rPr>
-          <w:rFonts w:hint="eastAsia"/>
+        <w:spacing w:line="360" w:lineRule="auto"/>
+      </w:pPr>
+      <w:r>
+        <w:rPr>
+          <w:rFonts w:hint="eastAsia" w:ascii="Times New Roman" w:hAnsi="Times New Roman" w:eastAsia="宋体"/>
+          <w:sz w:val="24"/>
         </w:rPr>
         <w:t xml:space="preserve">供电：USB-C</w:t>
       </w:r>
       <w:r>
+        <w:rPr>
+          <w:rFonts w:ascii="Times New Roman" w:hAnsi="Times New Roman" w:eastAsia="宋体"/>
+          <w:sz w:val="24"/>
+        </w:rPr>
         <w:t xml:space="preserve"> </w:t>
       </w:r>
       <w:r>
         <w:rPr>
-          <w:rFonts w:hint="eastAsia"/>
+          <w:rFonts w:hint="eastAsia" w:ascii="Times New Roman" w:hAnsi="Times New Roman" w:eastAsia="宋体"/>
+          <w:sz w:val="24"/>
         </w:rPr>
         <w:t xml:space="preserve">5V（4.8～5.5V），或通过板载桶形电源插座（DC</w:t>
       </w:r>
       <w:r>
+        <w:rPr>
+          <w:rFonts w:ascii="Times New Roman" w:hAnsi="Times New Roman" w:eastAsia="宋体"/>
+          <w:sz w:val="24"/>
+        </w:rPr>
         <w:t xml:space="preserve"> Jack / </w:t>
       </w:r>
       <w:r>
         <w:rPr>
-          <w:rFonts w:hint="eastAsia"/>
+          <w:rFonts w:hint="eastAsia" w:ascii="Times New Roman" w:hAnsi="Times New Roman" w:eastAsia="宋体"/>
+          <w:sz w:val="24"/>
         </w:rPr>
         <w:t xml:space="preserve">VIN）接外部直流</w:t>
       </w:r>
       <w:r>
+        <w:rPr>
+          <w:rFonts w:ascii="Times New Roman" w:hAnsi="Times New Roman" w:eastAsia="宋体"/>
+          <w:sz w:val="24"/>
+        </w:rPr>
         <w:t xml:space="preserve"> </w:t>
       </w:r>
       <w:r>
         <w:rPr>
-          <w:rFonts w:hint="eastAsia"/>
+          <w:rFonts w:hint="eastAsia" w:ascii="Times New Roman" w:hAnsi="Times New Roman" w:eastAsia="宋体"/>
+          <w:sz w:val="24"/>
         </w:rPr>
         <w:t xml:space="preserve">6～24V（推荐</w:t>
       </w:r>
       <w:r>
+        <w:rPr>
+          <w:rFonts w:ascii="Times New Roman" w:hAnsi="Times New Roman" w:eastAsia="宋体"/>
+          <w:sz w:val="24"/>
+        </w:rPr>
         <w:t xml:space="preserve"> </w:t>
       </w:r>
       <w:r>
         <w:rPr>
-          <w:rFonts w:hint="eastAsia"/>
+          <w:rFonts w:hint="eastAsia" w:ascii="Times New Roman" w:hAnsi="Times New Roman" w:eastAsia="宋体"/>
+          <w:sz w:val="24"/>
         </w:rPr>
         <w:t xml:space="preserve">7～12V）</w:t>
       </w:r>
@@ -6470,37 +6967,54 @@
           <w:ilvl w:val="0"/>
           <w:numId w:val="1010"/>
         </w:numPr>
-      </w:pPr>
-      <w:r>
-        <w:rPr>
-          <w:rFonts w:hint="eastAsia"/>
+        <w:spacing w:line="360" w:lineRule="auto"/>
+      </w:pPr>
+      <w:r>
+        <w:rPr>
+          <w:rFonts w:hint="eastAsia" w:ascii="Times New Roman" w:hAnsi="Times New Roman" w:eastAsia="宋体"/>
+          <w:sz w:val="24"/>
         </w:rPr>
         <w:t xml:space="preserve">电流：≥</w:t>
       </w:r>
       <w:r>
+        <w:rPr>
+          <w:rFonts w:ascii="Times New Roman" w:hAnsi="Times New Roman" w:eastAsia="宋体"/>
+          <w:sz w:val="24"/>
+        </w:rPr>
         <w:t xml:space="preserve"> </w:t>
       </w:r>
       <w:r>
         <w:rPr>
-          <w:rFonts w:hint="eastAsia"/>
+          <w:rFonts w:hint="eastAsia" w:ascii="Times New Roman" w:hAnsi="Times New Roman" w:eastAsia="宋体"/>
+          <w:sz w:val="24"/>
         </w:rPr>
         <w:t xml:space="preserve">500mA（WiFi</w:t>
       </w:r>
       <w:r>
+        <w:rPr>
+          <w:rFonts w:ascii="Times New Roman" w:hAnsi="Times New Roman" w:eastAsia="宋体"/>
+          <w:sz w:val="24"/>
+        </w:rPr>
         <w:t xml:space="preserve"> </w:t>
       </w:r>
       <w:r>
         <w:rPr>
-          <w:rFonts w:hint="eastAsia"/>
+          <w:rFonts w:hint="eastAsia" w:ascii="Times New Roman" w:hAnsi="Times New Roman" w:eastAsia="宋体"/>
+          <w:sz w:val="24"/>
         </w:rPr>
         <w:t xml:space="preserve">连接时峰值电流约</w:t>
       </w:r>
       <w:r>
+        <w:rPr>
+          <w:rFonts w:ascii="Times New Roman" w:hAnsi="Times New Roman" w:eastAsia="宋体"/>
+          <w:sz w:val="24"/>
+        </w:rPr>
         <w:t xml:space="preserve"> </w:t>
       </w:r>
       <w:r>
         <w:rPr>
-          <w:rFonts w:hint="eastAsia"/>
+          <w:rFonts w:hint="eastAsia" w:ascii="Times New Roman" w:hAnsi="Times New Roman" w:eastAsia="宋体"/>
+          <w:sz w:val="24"/>
         </w:rPr>
         <w:t xml:space="preserve">300mA）</w:t>
       </w:r>
@@ -6512,55 +7026,82 @@
           <w:ilvl w:val="0"/>
           <w:numId w:val="1010"/>
         </w:numPr>
-      </w:pPr>
-      <w:r>
-        <w:rPr>
-          <w:rFonts w:hint="eastAsia"/>
+        <w:spacing w:line="360" w:lineRule="auto"/>
+      </w:pPr>
+      <w:r>
+        <w:rPr>
+          <w:rFonts w:hint="eastAsia" w:ascii="Times New Roman" w:hAnsi="Times New Roman" w:eastAsia="宋体"/>
+          <w:sz w:val="24"/>
         </w:rPr>
         <w:t xml:space="preserve">推荐使用电脑</w:t>
       </w:r>
       <w:r>
+        <w:rPr>
+          <w:rFonts w:ascii="Times New Roman" w:hAnsi="Times New Roman" w:eastAsia="宋体"/>
+          <w:sz w:val="24"/>
+        </w:rPr>
         <w:t xml:space="preserve"> USB </w:t>
       </w:r>
       <w:r>
         <w:rPr>
-          <w:rFonts w:hint="eastAsia"/>
+          <w:rFonts w:hint="eastAsia" w:ascii="Times New Roman" w:hAnsi="Times New Roman" w:eastAsia="宋体"/>
+          <w:sz w:val="24"/>
         </w:rPr>
         <w:t xml:space="preserve">口或</w:t>
       </w:r>
       <w:r>
+        <w:rPr>
+          <w:rFonts w:ascii="Times New Roman" w:hAnsi="Times New Roman" w:eastAsia="宋体"/>
+          <w:sz w:val="24"/>
+        </w:rPr>
         <w:t xml:space="preserve"> 5V/2A </w:t>
       </w:r>
       <w:r>
         <w:rPr>
-          <w:rFonts w:hint="eastAsia"/>
+          <w:rFonts w:hint="eastAsia" w:ascii="Times New Roman" w:hAnsi="Times New Roman" w:eastAsia="宋体"/>
+          <w:sz w:val="24"/>
         </w:rPr>
         <w:t xml:space="preserve">电源适配器（其中</w:t>
       </w:r>
       <w:r>
+        <w:rPr>
+          <w:rFonts w:ascii="Times New Roman" w:hAnsi="Times New Roman" w:eastAsia="宋体"/>
+          <w:sz w:val="24"/>
+        </w:rPr>
         <w:t xml:space="preserve"> sEMG </w:t>
       </w:r>
       <w:r>
         <w:rPr>
-          <w:rFonts w:hint="eastAsia"/>
+          <w:rFonts w:hint="eastAsia" w:ascii="Times New Roman" w:hAnsi="Times New Roman" w:eastAsia="宋体"/>
+          <w:sz w:val="24"/>
         </w:rPr>
         <w:t xml:space="preserve">传感器自身需</w:t>
       </w:r>
       <w:r>
+        <w:rPr>
+          <w:rFonts w:ascii="Times New Roman" w:hAnsi="Times New Roman" w:eastAsia="宋体"/>
+          <w:sz w:val="24"/>
+        </w:rPr>
         <w:t xml:space="preserve"> ≥ 20mA </w:t>
       </w:r>
       <w:r>
         <w:rPr>
-          <w:rFonts w:hint="eastAsia"/>
+          <w:rFonts w:hint="eastAsia" w:ascii="Times New Roman" w:hAnsi="Times New Roman" w:eastAsia="宋体"/>
+          <w:sz w:val="24"/>
         </w:rPr>
         <w:t xml:space="preserve">稳压供电，由板载</w:t>
       </w:r>
       <w:r>
+        <w:rPr>
+          <w:rFonts w:ascii="Times New Roman" w:hAnsi="Times New Roman" w:eastAsia="宋体"/>
+          <w:sz w:val="24"/>
+        </w:rPr>
         <w:t xml:space="preserve"> 5V </w:t>
       </w:r>
       <w:r>
         <w:rPr>
-          <w:rFonts w:hint="eastAsia"/>
+          <w:rFonts w:hint="eastAsia" w:ascii="Times New Roman" w:hAnsi="Times New Roman" w:eastAsia="宋体"/>
+          <w:sz w:val="24"/>
         </w:rPr>
         <w:t xml:space="preserve">直接提供）</w:t>
       </w:r>
@@ -6592,23 +7133,34 @@
     <w:p>
       <w:pPr>
         <w:pStyle w:val="BlockText"/>
-      </w:pPr>
-      <w:r>
-        <w:rPr>
-          <w:rFonts w:hint="eastAsia"/>
+        <w:spacing w:line="360" w:lineRule="auto"/>
+      </w:pPr>
+      <w:r>
+        <w:rPr>
+          <w:rFonts w:hint="eastAsia" w:ascii="Times New Roman" w:hAnsi="Times New Roman" w:eastAsia="宋体"/>
+          <w:sz w:val="24"/>
         </w:rPr>
         <w:t xml:space="preserve">电极接触压力对</w:t>
       </w:r>
       <w:r>
+        <w:rPr>
+          <w:rFonts w:ascii="Times New Roman" w:hAnsi="Times New Roman" w:eastAsia="宋体"/>
+          <w:sz w:val="24"/>
+        </w:rPr>
         <w:t xml:space="preserve"> RMS </w:t>
       </w:r>
       <w:r>
         <w:rPr>
-          <w:rFonts w:hint="eastAsia"/>
+          <w:rFonts w:hint="eastAsia" w:ascii="Times New Roman" w:hAnsi="Times New Roman" w:eastAsia="宋体"/>
+          <w:sz w:val="24"/>
         </w:rPr>
         <w:t xml:space="preserve">的影响、激活度与疲劳度的算法定义，见</w:t>
       </w:r>
       <w:r>
+        <w:rPr>
+          <w:rFonts w:ascii="Times New Roman" w:hAnsi="Times New Roman" w:eastAsia="宋体"/>
+          <w:sz w:val="24"/>
+        </w:rPr>
         <w:t xml:space="preserve"> </w:t>
       </w:r>
       <w:hyperlink r:id="rId10">
@@ -6621,6 +7173,10 @@
         </w:r>
       </w:hyperlink>
       <w:r>
+        <w:rPr>
+          <w:rFonts w:ascii="Times New Roman" w:hAnsi="Times New Roman" w:eastAsia="宋体"/>
+          <w:sz w:val="24"/>
+        </w:rPr>
         <w:t xml:space="preserve">。</w:t>
       </w:r>
     </w:p>
@@ -6631,46 +7187,71 @@
           <w:ilvl w:val="0"/>
           <w:numId w:val="1011"/>
         </w:numPr>
-      </w:pPr>
-      <w:r>
-        <w:rPr>
-          <w:rFonts w:hint="eastAsia"/>
+        <w:spacing w:line="360" w:lineRule="auto"/>
+      </w:pPr>
+      <w:r>
+        <w:rPr>
+          <w:rFonts w:hint="eastAsia" w:ascii="Times New Roman" w:hAnsi="Times New Roman" w:eastAsia="宋体"/>
           <w:b/>
           <w:bCs/>
+          <w:sz w:val="24"/>
         </w:rPr>
         <w:t xml:space="preserve">电极贴附</w:t>
       </w:r>
       <w:r>
+        <w:rPr>
+          <w:rFonts w:ascii="Times New Roman" w:hAnsi="Times New Roman" w:eastAsia="宋体"/>
+          <w:sz w:val="24"/>
+        </w:rPr>
         <w:t xml:space="preserve"> </w:t>
       </w:r>
       <w:r>
+        <w:rPr>
+          <w:rFonts w:ascii="Times New Roman" w:hAnsi="Times New Roman" w:eastAsia="宋体"/>
+          <w:sz w:val="24"/>
+        </w:rPr>
         <w:t xml:space="preserve">— </w:t>
       </w:r>
       <w:r>
         <w:rPr>
-          <w:rFonts w:hint="eastAsia"/>
+          <w:rFonts w:hint="eastAsia" w:ascii="Times New Roman" w:hAnsi="Times New Roman" w:eastAsia="宋体"/>
+          <w:sz w:val="24"/>
         </w:rPr>
         <w:t xml:space="preserve">贴附方向</w:t>
       </w:r>
       <w:r>
+        <w:rPr>
+          <w:rFonts w:ascii="Times New Roman" w:hAnsi="Times New Roman" w:eastAsia="宋体"/>
+          <w:sz w:val="24"/>
+        </w:rPr>
         <w:t xml:space="preserve"> / </w:t>
       </w:r>
       <w:r>
         <w:rPr>
-          <w:rFonts w:hint="eastAsia"/>
+          <w:rFonts w:hint="eastAsia" w:ascii="Times New Roman" w:hAnsi="Times New Roman" w:eastAsia="宋体"/>
+          <w:sz w:val="24"/>
         </w:rPr>
         <w:t xml:space="preserve">接触状态直接影响信号质量；具体贴法见</w:t>
       </w:r>
       <w:r>
+        <w:rPr>
+          <w:rFonts w:ascii="Times New Roman" w:hAnsi="Times New Roman" w:eastAsia="宋体"/>
+          <w:sz w:val="24"/>
+        </w:rPr>
         <w:t xml:space="preserve"> </w:t>
       </w:r>
       <w:r>
         <w:rPr>
-          <w:rFonts w:hint="eastAsia"/>
+          <w:rFonts w:hint="eastAsia" w:ascii="Times New Roman" w:hAnsi="Times New Roman" w:eastAsia="宋体"/>
+          <w:sz w:val="24"/>
         </w:rPr>
         <w:t xml:space="preserve">§4.1，接触不良排查见</w:t>
       </w:r>
       <w:r>
+        <w:rPr>
+          <w:rFonts w:ascii="Times New Roman" w:hAnsi="Times New Roman" w:eastAsia="宋体"/>
+          <w:sz w:val="24"/>
+        </w:rPr>
         <w:t xml:space="preserve"> §4.2。</w:t>
       </w:r>
     </w:p>
@@ -6681,33 +7262,49 @@
           <w:ilvl w:val="0"/>
           <w:numId w:val="1011"/>
         </w:numPr>
-      </w:pPr>
-      <w:r>
-        <w:rPr>
-          <w:rFonts w:hint="eastAsia"/>
+        <w:spacing w:line="360" w:lineRule="auto"/>
+      </w:pPr>
+      <w:r>
+        <w:rPr>
+          <w:rFonts w:hint="eastAsia" w:ascii="Times New Roman" w:hAnsi="Times New Roman" w:eastAsia="宋体"/>
           <w:b/>
           <w:bCs/>
+          <w:sz w:val="24"/>
         </w:rPr>
         <w:t xml:space="preserve">电极维护</w:t>
       </w:r>
       <w:r>
+        <w:rPr>
+          <w:rFonts w:ascii="Times New Roman" w:hAnsi="Times New Roman" w:eastAsia="宋体"/>
+          <w:sz w:val="24"/>
+        </w:rPr>
         <w:t xml:space="preserve"> </w:t>
       </w:r>
       <w:r>
+        <w:rPr>
+          <w:rFonts w:ascii="Times New Roman" w:hAnsi="Times New Roman" w:eastAsia="宋体"/>
+          <w:sz w:val="24"/>
+        </w:rPr>
         <w:t xml:space="preserve">— </w:t>
       </w:r>
       <w:r>
         <w:rPr>
-          <w:rFonts w:hint="eastAsia"/>
+          <w:rFonts w:hint="eastAsia" w:ascii="Times New Roman" w:hAnsi="Times New Roman" w:eastAsia="宋体"/>
+          <w:sz w:val="24"/>
         </w:rPr>
         <w:t xml:space="preserve">干电极为易耗件，信号明显变差或表面污染</w:t>
       </w:r>
       <w:r>
+        <w:rPr>
+          <w:rFonts w:ascii="Times New Roman" w:hAnsi="Times New Roman" w:eastAsia="宋体"/>
+          <w:sz w:val="24"/>
+        </w:rPr>
         <w:t xml:space="preserve"> / </w:t>
       </w:r>
       <w:r>
         <w:rPr>
-          <w:rFonts w:hint="eastAsia"/>
+          <w:rFonts w:hint="eastAsia" w:ascii="Times New Roman" w:hAnsi="Times New Roman" w:eastAsia="宋体"/>
+          <w:sz w:val="24"/>
         </w:rPr>
         <w:t xml:space="preserve">氧化时应及时更换。</w:t>
       </w:r>
@@ -6719,33 +7316,49 @@
           <w:ilvl w:val="0"/>
           <w:numId w:val="1011"/>
         </w:numPr>
-      </w:pPr>
-      <w:r>
-        <w:rPr>
-          <w:rFonts w:hint="eastAsia"/>
+        <w:spacing w:line="360" w:lineRule="auto"/>
+      </w:pPr>
+      <w:r>
+        <w:rPr>
+          <w:rFonts w:hint="eastAsia" w:ascii="Times New Roman" w:hAnsi="Times New Roman" w:eastAsia="宋体"/>
           <w:b/>
           <w:bCs/>
+          <w:sz w:val="24"/>
         </w:rPr>
         <w:t xml:space="preserve">非医疗声明</w:t>
       </w:r>
       <w:r>
+        <w:rPr>
+          <w:rFonts w:ascii="Times New Roman" w:hAnsi="Times New Roman" w:eastAsia="宋体"/>
+          <w:sz w:val="24"/>
+        </w:rPr>
         <w:t xml:space="preserve"> </w:t>
       </w:r>
       <w:r>
+        <w:rPr>
+          <w:rFonts w:ascii="Times New Roman" w:hAnsi="Times New Roman" w:eastAsia="宋体"/>
+          <w:sz w:val="24"/>
+        </w:rPr>
         <w:t xml:space="preserve">— </w:t>
       </w:r>
       <w:r>
         <w:rPr>
-          <w:rFonts w:hint="eastAsia"/>
+          <w:rFonts w:hint="eastAsia" w:ascii="Times New Roman" w:hAnsi="Times New Roman" w:eastAsia="宋体"/>
+          <w:sz w:val="24"/>
         </w:rPr>
         <w:t xml:space="preserve">本设备为教学</w:t>
       </w:r>
       <w:r>
+        <w:rPr>
+          <w:rFonts w:ascii="Times New Roman" w:hAnsi="Times New Roman" w:eastAsia="宋体"/>
+          <w:sz w:val="24"/>
+        </w:rPr>
         <w:t xml:space="preserve"> / </w:t>
       </w:r>
       <w:r>
         <w:rPr>
-          <w:rFonts w:hint="eastAsia"/>
+          <w:rFonts w:hint="eastAsia" w:ascii="Times New Roman" w:hAnsi="Times New Roman" w:eastAsia="宋体"/>
+          <w:sz w:val="24"/>
         </w:rPr>
         <w:t xml:space="preserve">科研用途的表面肌电采集装置，非专业医疗仪器，不得用于诊断或治疗。</w:t>
       </w:r>
@@ -6765,7 +7378,7 @@
         <w:numRestart w:val="eachSect"/>
       </w:footnotePr>
       <w:pgSz w:w="11906" w:h="16838"/>
-      <w:pgMar w:top="1417" w:bottom="1417" w:left="1417" w:right="1417"/>
+      <w:pgMar w:top="1440" w:bottom="1440" w:left="1800" w:right="1800"/>
     </w:sectPr>
   </w:body>
 </w:document>

</xml_diff>